<commit_message>
cap2: agrega sección de metodologias de otros investigadores
</commit_message>
<xml_diff>
--- a/docs/Capítulo 2.docx
+++ b/docs/Capítulo 2.docx
@@ -5582,7 +5582,19 @@
         <w:pStyle w:val="TextoPrincipal"/>
       </w:pPr>
       <w:r>
-        <w:t>El presente estudio se sustenta en dos cuerpos teórico-metodológicos complementarios: el modelo de madurez de gobernanza de IA responsable propuesto por Reuel et al. (2025), y el marco comparativo de regulación global de IA desarrollado por Vujicic (2024). Ambas aportaciones son pertinentes porque permiten, por un lado, medir el estado actual de las organizaciones y, por el otro, contextualizar ese estado dentro del panorama regulatorio que las afecta, proporcionando así un andamiaje analítico tanto cuantitativo como normativo para la investigación.</w:t>
+        <w:t xml:space="preserve">El presente estudio se sustenta en dos </w:t>
+      </w:r>
+      <w:r>
+        <w:t>investigaciones</w:t>
+      </w:r>
+      <w:r>
+        <w:t xml:space="preserve"> complementari</w:t>
+      </w:r>
+      <w:r>
+        <w:t>as</w:t>
+      </w:r>
+      <w:r>
+        <w:t>: el modelo de madurez de gobernanza de IA responsable propuesto por Reuel et al. (2025), y el marco comparativo de regulación global de IA desarrollado por Vujicic (2024). Ambas aportaciones son pertinentes porque permiten, por un lado, medir el estado actual de las organizaciones y, por el otro, contextualizar ese estado dentro del panorama regulatorio que las afecta, proporcionando así un andamiaje analítico tanto cuantitativo como normativo para la investigación.</w:t>
       </w:r>
     </w:p>
     <w:p>
@@ -5761,7 +5773,14 @@
         <w:rPr>
           <w:lang w:val="es-419"/>
         </w:rPr>
-        <w:t>. El modelo se articula en cinco niveles progresivos, denominados Inicial, Emergente, Determinado, Establecido y Optimizado, que describen una trayectoria desde la ausencia total de procesos formales hasta prácticas proactivas y plenamente operacionalizadas.</w:t>
+        <w:t xml:space="preserve">. El modelo se articula en cinco niveles progresivos, denominados Inicial, Emergente, Determinado, Establecido y Optimizado, que describen una trayectoria desde la ausencia total de procesos formales hasta prácticas proactivas y </w:t>
+      </w:r>
+      <w:r>
+        <w:rPr>
+          <w:lang w:val="es-419"/>
+        </w:rPr>
+        <w:lastRenderedPageBreak/>
+        <w:t>plenamente operacionalizadas.</w:t>
       </w:r>
     </w:p>
     <w:p>
@@ -5789,7 +5808,6 @@
         <w:rPr>
           <w:lang w:val="es-419"/>
         </w:rPr>
-        <w:lastRenderedPageBreak/>
         <w:t>Este modelo es directamente importante para la presente investigación porque proporciona el instrumento conceptual para ubicar a las organizaciones hondureñas en una escala de madurez comparable a la de otras regiones del mundo. Entre los hallazgos, también se señala que América Latina registra los niveles más bajos de madurez en gobernanza de IA responsable entre todas las regiones que fueron evaluadas, con una proporción significativa de organizaciones clasificadas en el nivel Inicial. (Reuel et al., 2025)</w:t>
       </w:r>
     </w:p>
@@ -5869,7 +5887,14 @@
         <w:rPr>
           <w:lang w:val="es-419"/>
         </w:rPr>
-        <w:t>El aporte del marco es demostrar que el cumplimiento regulatorio no es un costo estático, sino una estrategia dinámica que condiciona la competitividad de las organizaciones. La autora introduce también el concepto de alineación regulatoria temprana como un factor diferenciador: las organizaciones que incorporan consideraciones de cumplimiento desde las fases iniciales del diseño de sus productos obtienen ventajas en su velocidad de entrada al mercado y una reducción de reducción de exposición legal (Vujicic, 2024).</w:t>
+        <w:t xml:space="preserve">El aporte del marco es demostrar que el cumplimiento regulatorio no es un costo estático, sino una estrategia dinámica que condiciona la competitividad de las organizaciones. La autora introduce también el concepto de alineación regulatoria temprana como un factor diferenciador: las organizaciones que incorporan consideraciones de cumplimiento desde las fases iniciales del diseño de sus productos obtienen ventajas en su velocidad de entrada al mercado y una reducción </w:t>
+      </w:r>
+      <w:r>
+        <w:rPr>
+          <w:lang w:val="es-419"/>
+        </w:rPr>
+        <w:lastRenderedPageBreak/>
+        <w:t>de reducción de exposición legal (Vujicic, 2024).</w:t>
       </w:r>
     </w:p>
     <w:p>
@@ -5927,7 +5952,6 @@
         <w:rPr>
           <w:lang w:val="es-ES"/>
         </w:rPr>
-        <w:lastRenderedPageBreak/>
         <w:t>Complementariedad de los Modelos</w:t>
       </w:r>
       <w:bookmarkEnd w:id="56"/>
@@ -5975,8 +5999,182 @@
     </w:p>
     <w:p>
       <w:pPr>
+        <w:pStyle w:val="ListParagraph"/>
+        <w:numPr>
+          <w:ilvl w:val="1"/>
+          <w:numId w:val="2"/>
+        </w:numPr>
+        <w:spacing w:after="120" w:line="360" w:lineRule="auto"/>
+        <w:outlineLvl w:val="1"/>
+        <w:rPr>
+          <w:rFonts w:ascii="Times New Roman" w:eastAsia="Times New Roman" w:hAnsi="Times New Roman"/>
+          <w:b/>
+          <w:bCs/>
+          <w:vanish/>
+          <w:sz w:val="24"/>
+          <w:szCs w:val="32"/>
+          <w:lang w:val="es-ES"/>
+        </w:rPr>
+      </w:pPr>
+    </w:p>
+    <w:p>
+      <w:pPr>
+        <w:pStyle w:val="Heading2"/>
+        <w:numPr>
+          <w:ilvl w:val="2"/>
+          <w:numId w:val="2"/>
+        </w:numPr>
+        <w:spacing w:line="360" w:lineRule="auto"/>
+        <w:rPr>
+          <w:lang w:val="es-ES"/>
+        </w:rPr>
+      </w:pPr>
+      <w:r>
+        <w:rPr>
+          <w:lang w:val="es-ES"/>
+        </w:rPr>
+        <w:t>Encuesta Estructurada a Gran Escala</w:t>
+      </w:r>
+    </w:p>
+    <w:p>
+      <w:pPr>
         <w:pStyle w:val="TextoPrincipal"/>
-      </w:pPr>
+        <w:rPr>
+          <w:lang w:val="es-ES"/>
+        </w:rPr>
+      </w:pPr>
+      <w:r>
+        <w:rPr>
+          <w:lang w:val="es-ES"/>
+        </w:rPr>
+        <w:t>Reuel et al. (2025) emplearon una metodología empírica cuantitativa basada en una encuesta estructurada. El instrumento fue diseñado para evaluar el nivel de madurez operacional y organizacional en la adopción de IA responsable, utilizando una escala de cinco niveles. Los resultados se analizaron mediante técnicas estadísticas, complementadas con entrevistas a expertos para validar ciertos hallazgos.</w:t>
+      </w:r>
+    </w:p>
+    <w:p>
+      <w:pPr>
+        <w:pStyle w:val="Heading2"/>
+        <w:numPr>
+          <w:ilvl w:val="2"/>
+          <w:numId w:val="2"/>
+        </w:numPr>
+        <w:spacing w:line="360" w:lineRule="auto"/>
+        <w:rPr>
+          <w:lang w:val="es-ES"/>
+        </w:rPr>
+      </w:pPr>
+      <w:r>
+        <w:rPr>
+          <w:lang w:val="es-ES"/>
+        </w:rPr>
+        <w:t>Revisión Bibliométrica y Sistemática</w:t>
+      </w:r>
+    </w:p>
+    <w:p>
+      <w:pPr>
+        <w:pStyle w:val="TextoPrincipal"/>
+        <w:rPr>
+          <w:lang w:val="es-ES"/>
+        </w:rPr>
+      </w:pPr>
+      <w:r>
+        <w:rPr>
+          <w:lang w:val="es-ES"/>
+        </w:rPr>
+        <w:t xml:space="preserve">Yesuf y Fields (2025) utilizaron un enfoque mixto de análisis bibliométrico y revisión sistemática de artículos científicos. Emplearon herramientas para identificar las estructuras de </w:t>
+      </w:r>
+      <w:r>
+        <w:rPr>
+          <w:lang w:val="es-ES"/>
+        </w:rPr>
+        <w:lastRenderedPageBreak/>
+        <w:t>conocimiento existentes sobre adopción de IA en pymes. También, realizaron un análisis de contenido de estudios para extraer temas emergentes y brechas de investigación. La limitación identificada por los autores es precisamente relacionada con la presente investigación: la escasez de estudios longitudinales y la subrepresentación de pymes en economías en desarrollo.</w:t>
+      </w:r>
+    </w:p>
+    <w:p>
+      <w:pPr>
+        <w:pStyle w:val="Heading2"/>
+        <w:numPr>
+          <w:ilvl w:val="2"/>
+          <w:numId w:val="2"/>
+        </w:numPr>
+        <w:spacing w:line="360" w:lineRule="auto"/>
+        <w:rPr>
+          <w:lang w:val="es-ES"/>
+        </w:rPr>
+      </w:pPr>
+      <w:r>
+        <w:rPr>
+          <w:lang w:val="es-ES"/>
+        </w:rPr>
+        <w:t>Análisis Jurídico Comparativo con Estudio de Caso</w:t>
+      </w:r>
+    </w:p>
+    <w:p>
+      <w:pPr>
+        <w:pStyle w:val="TextoPrincipal"/>
+        <w:rPr>
+          <w:lang w:val="es-ES"/>
+        </w:rPr>
+      </w:pPr>
+      <w:r>
+        <w:rPr>
+          <w:lang w:val="es-ES"/>
+        </w:rPr>
+        <w:t>Vujicic (2024) empleó un enfoque mixto que combina: análisis jurídico de textos normativos, entrevistas semiestructuras a expertos y consultores, y un estudio de caso para simular el proceso de cumplimiento regulatorio en seis jurisdicciones. Este enfoque permitió contrastar el análisis normativo con perspectivas de expertos y una simulación práctica.</w:t>
+      </w:r>
+    </w:p>
+    <w:p>
+      <w:pPr>
+        <w:pStyle w:val="TextoPrincipal"/>
+        <w:rPr>
+          <w:lang w:val="es-ES"/>
+        </w:rPr>
+      </w:pPr>
+      <w:r>
+        <w:rPr>
+          <w:lang w:val="es-ES"/>
+        </w:rPr>
+        <w:t>Perboli, Simionato y Pratali (2025) utilizaron un diseño metodológico comparable, analizando la regulación de varias regiones, además de incorporar datos de organismos como Gartner Research, McKinsey Global Institute y Deloitte Consulting para medir los costos del cumplimiento regulatorio.</w:t>
+      </w:r>
+    </w:p>
+    <w:p>
+      <w:pPr>
+        <w:pStyle w:val="Heading2"/>
+        <w:numPr>
+          <w:ilvl w:val="2"/>
+          <w:numId w:val="2"/>
+        </w:numPr>
+        <w:spacing w:line="360" w:lineRule="auto"/>
+        <w:rPr>
+          <w:lang w:val="es-ES"/>
+        </w:rPr>
+      </w:pPr>
+      <w:r>
+        <w:rPr>
+          <w:lang w:val="es-ES"/>
+        </w:rPr>
+        <w:t xml:space="preserve">Análisis </w:t>
+      </w:r>
+      <w:r>
+        <w:rPr>
+          <w:lang w:val="es-ES"/>
+        </w:rPr>
+        <w:t>de Experto con base en Reportes de Terceros</w:t>
+      </w:r>
+    </w:p>
+    <w:p>
+      <w:pPr>
+        <w:pStyle w:val="TextoPrincipal"/>
+        <w:rPr>
+          <w:lang w:val="es-ES"/>
+        </w:rPr>
+      </w:pPr>
+      <w:r>
+        <w:rPr>
+          <w:lang w:val="es-ES"/>
+        </w:rPr>
+        <w:t>Mathew (2025) utilizó un enfoque de análisis de experto sustentado en informes de terceros de alta credibilidad y los marcos normativos del NIST AI RMF y el EU AI Act. La limitación de este enfoque, reconocida por el autor, es que la efectividad de los controles propuestos depende de un nivel previo de cultura organizacional que no siempre existe, particularmente en el contexto de economías emergentes.</w:t>
+      </w:r>
     </w:p>
     <w:p>
       <w:pPr>
@@ -6923,6 +7121,119 @@
     </w:lvl>
   </w:abstractNum>
   <w:abstractNum w:abstractNumId="2" w15:restartNumberingAfterBreak="0">
+    <w:nsid w:val="09926A4D"/>
+    <w:multiLevelType w:val="multilevel"/>
+    <w:tmpl w:val="85E29472"/>
+    <w:lvl w:ilvl="0">
+      <w:start w:val="1"/>
+      <w:numFmt w:val="decimal"/>
+      <w:lvlText w:val="%1"/>
+      <w:lvlJc w:val="left"/>
+      <w:pPr>
+        <w:ind w:left="360" w:hanging="360"/>
+      </w:pPr>
+      <w:rPr>
+        <w:rFonts w:hint="default"/>
+      </w:rPr>
+    </w:lvl>
+    <w:lvl w:ilvl="1">
+      <w:start w:val="1"/>
+      <w:numFmt w:val="decimal"/>
+      <w:lvlText w:val="%1.%2"/>
+      <w:lvlJc w:val="left"/>
+      <w:pPr>
+        <w:ind w:left="360" w:hanging="360"/>
+      </w:pPr>
+      <w:rPr>
+        <w:rFonts w:hint="default"/>
+      </w:rPr>
+    </w:lvl>
+    <w:lvl w:ilvl="2">
+      <w:start w:val="1"/>
+      <w:numFmt w:val="decimal"/>
+      <w:lvlText w:val="%1.%2.%3"/>
+      <w:lvlJc w:val="left"/>
+      <w:pPr>
+        <w:ind w:left="720" w:hanging="720"/>
+      </w:pPr>
+      <w:rPr>
+        <w:rFonts w:hint="default"/>
+      </w:rPr>
+    </w:lvl>
+    <w:lvl w:ilvl="3">
+      <w:start w:val="1"/>
+      <w:numFmt w:val="decimal"/>
+      <w:lvlText w:val="%1.%2.%3.%4"/>
+      <w:lvlJc w:val="left"/>
+      <w:pPr>
+        <w:ind w:left="720" w:hanging="720"/>
+      </w:pPr>
+      <w:rPr>
+        <w:rFonts w:hint="default"/>
+      </w:rPr>
+    </w:lvl>
+    <w:lvl w:ilvl="4">
+      <w:start w:val="1"/>
+      <w:numFmt w:val="decimal"/>
+      <w:lvlText w:val="%1.%2.%3.%4.%5"/>
+      <w:lvlJc w:val="left"/>
+      <w:pPr>
+        <w:ind w:left="1080" w:hanging="1080"/>
+      </w:pPr>
+      <w:rPr>
+        <w:rFonts w:hint="default"/>
+      </w:rPr>
+    </w:lvl>
+    <w:lvl w:ilvl="5">
+      <w:start w:val="1"/>
+      <w:numFmt w:val="decimal"/>
+      <w:lvlText w:val="%1.%2.%3.%4.%5.%6"/>
+      <w:lvlJc w:val="left"/>
+      <w:pPr>
+        <w:ind w:left="1080" w:hanging="1080"/>
+      </w:pPr>
+      <w:rPr>
+        <w:rFonts w:hint="default"/>
+      </w:rPr>
+    </w:lvl>
+    <w:lvl w:ilvl="6">
+      <w:start w:val="1"/>
+      <w:numFmt w:val="decimal"/>
+      <w:lvlText w:val="%1.%2.%3.%4.%5.%6.%7"/>
+      <w:lvlJc w:val="left"/>
+      <w:pPr>
+        <w:ind w:left="1440" w:hanging="1440"/>
+      </w:pPr>
+      <w:rPr>
+        <w:rFonts w:hint="default"/>
+      </w:rPr>
+    </w:lvl>
+    <w:lvl w:ilvl="7">
+      <w:start w:val="1"/>
+      <w:numFmt w:val="decimal"/>
+      <w:lvlText w:val="%1.%2.%3.%4.%5.%6.%7.%8"/>
+      <w:lvlJc w:val="left"/>
+      <w:pPr>
+        <w:ind w:left="1440" w:hanging="1440"/>
+      </w:pPr>
+      <w:rPr>
+        <w:rFonts w:hint="default"/>
+      </w:rPr>
+    </w:lvl>
+    <w:lvl w:ilvl="8">
+      <w:start w:val="1"/>
+      <w:numFmt w:val="decimal"/>
+      <w:lvlText w:val="%1.%2.%3.%4.%5.%6.%7.%8.%9"/>
+      <w:lvlJc w:val="left"/>
+      <w:pPr>
+        <w:ind w:left="1800" w:hanging="1800"/>
+      </w:pPr>
+      <w:rPr>
+        <w:rFonts w:hint="default"/>
+      </w:rPr>
+    </w:lvl>
+  </w:abstractNum>
+  <w:abstractNum w:abstractNumId="3" w15:restartNumberingAfterBreak="0">
     <w:nsid w:val="0DC166D0"/>
     <w:multiLevelType w:val="hybridMultilevel"/>
     <w:tmpl w:val="201A0D54"/>
@@ -7008,7 +7319,7 @@
       </w:pPr>
     </w:lvl>
   </w:abstractNum>
-  <w:abstractNum w:abstractNumId="3" w15:restartNumberingAfterBreak="0">
+  <w:abstractNum w:abstractNumId="4" w15:restartNumberingAfterBreak="0">
     <w:nsid w:val="11E373AE"/>
     <w:multiLevelType w:val="hybridMultilevel"/>
     <w:tmpl w:val="40403BCA"/>
@@ -7121,7 +7432,7 @@
       </w:rPr>
     </w:lvl>
   </w:abstractNum>
-  <w:abstractNum w:abstractNumId="4" w15:restartNumberingAfterBreak="0">
+  <w:abstractNum w:abstractNumId="5" w15:restartNumberingAfterBreak="0">
     <w:nsid w:val="14D67FBB"/>
     <w:multiLevelType w:val="multilevel"/>
     <w:tmpl w:val="5C88505C"/>
@@ -7234,7 +7545,7 @@
       </w:rPr>
     </w:lvl>
   </w:abstractNum>
-  <w:abstractNum w:abstractNumId="5" w15:restartNumberingAfterBreak="0">
+  <w:abstractNum w:abstractNumId="6" w15:restartNumberingAfterBreak="0">
     <w:nsid w:val="1A585D70"/>
     <w:multiLevelType w:val="multilevel"/>
     <w:tmpl w:val="0409001F"/>
@@ -7320,7 +7631,7 @@
       </w:pPr>
     </w:lvl>
   </w:abstractNum>
-  <w:abstractNum w:abstractNumId="6" w15:restartNumberingAfterBreak="0">
+  <w:abstractNum w:abstractNumId="7" w15:restartNumberingAfterBreak="0">
     <w:nsid w:val="1B1F35C0"/>
     <w:multiLevelType w:val="hybridMultilevel"/>
     <w:tmpl w:val="85160A64"/>
@@ -7433,7 +7744,7 @@
       </w:rPr>
     </w:lvl>
   </w:abstractNum>
-  <w:abstractNum w:abstractNumId="7" w15:restartNumberingAfterBreak="0">
+  <w:abstractNum w:abstractNumId="8" w15:restartNumberingAfterBreak="0">
     <w:nsid w:val="1B803895"/>
     <w:multiLevelType w:val="hybridMultilevel"/>
     <w:tmpl w:val="6E8091B6"/>
@@ -7546,7 +7857,7 @@
       </w:rPr>
     </w:lvl>
   </w:abstractNum>
-  <w:abstractNum w:abstractNumId="8" w15:restartNumberingAfterBreak="0">
+  <w:abstractNum w:abstractNumId="9" w15:restartNumberingAfterBreak="0">
     <w:nsid w:val="1C2035E1"/>
     <w:multiLevelType w:val="multilevel"/>
     <w:tmpl w:val="5C88505C"/>
@@ -7659,7 +7970,7 @@
       </w:rPr>
     </w:lvl>
   </w:abstractNum>
-  <w:abstractNum w:abstractNumId="9" w15:restartNumberingAfterBreak="0">
+  <w:abstractNum w:abstractNumId="10" w15:restartNumberingAfterBreak="0">
     <w:nsid w:val="261A6422"/>
     <w:multiLevelType w:val="hybridMultilevel"/>
     <w:tmpl w:val="5B681C36"/>
@@ -7775,7 +8086,7 @@
       </w:rPr>
     </w:lvl>
   </w:abstractNum>
-  <w:abstractNum w:abstractNumId="10" w15:restartNumberingAfterBreak="0">
+  <w:abstractNum w:abstractNumId="11" w15:restartNumberingAfterBreak="0">
     <w:nsid w:val="27DA2063"/>
     <w:multiLevelType w:val="hybridMultilevel"/>
     <w:tmpl w:val="4CBC188A"/>
@@ -7888,7 +8199,7 @@
       </w:rPr>
     </w:lvl>
   </w:abstractNum>
-  <w:abstractNum w:abstractNumId="11" w15:restartNumberingAfterBreak="0">
+  <w:abstractNum w:abstractNumId="12" w15:restartNumberingAfterBreak="0">
     <w:nsid w:val="2F755377"/>
     <w:multiLevelType w:val="hybridMultilevel"/>
     <w:tmpl w:val="47B09F5C"/>
@@ -8001,7 +8312,7 @@
       </w:rPr>
     </w:lvl>
   </w:abstractNum>
-  <w:abstractNum w:abstractNumId="12" w15:restartNumberingAfterBreak="0">
+  <w:abstractNum w:abstractNumId="13" w15:restartNumberingAfterBreak="0">
     <w:nsid w:val="334641CA"/>
     <w:multiLevelType w:val="multilevel"/>
     <w:tmpl w:val="85E29472"/>
@@ -8114,7 +8425,120 @@
       </w:rPr>
     </w:lvl>
   </w:abstractNum>
-  <w:abstractNum w:abstractNumId="13" w15:restartNumberingAfterBreak="0">
+  <w:abstractNum w:abstractNumId="14" w15:restartNumberingAfterBreak="0">
+    <w:nsid w:val="459D5FB7"/>
+    <w:multiLevelType w:val="multilevel"/>
+    <w:tmpl w:val="85E29472"/>
+    <w:lvl w:ilvl="0">
+      <w:start w:val="1"/>
+      <w:numFmt w:val="decimal"/>
+      <w:lvlText w:val="%1"/>
+      <w:lvlJc w:val="left"/>
+      <w:pPr>
+        <w:ind w:left="360" w:hanging="360"/>
+      </w:pPr>
+      <w:rPr>
+        <w:rFonts w:hint="default"/>
+      </w:rPr>
+    </w:lvl>
+    <w:lvl w:ilvl="1">
+      <w:start w:val="1"/>
+      <w:numFmt w:val="decimal"/>
+      <w:lvlText w:val="%1.%2"/>
+      <w:lvlJc w:val="left"/>
+      <w:pPr>
+        <w:ind w:left="360" w:hanging="360"/>
+      </w:pPr>
+      <w:rPr>
+        <w:rFonts w:hint="default"/>
+      </w:rPr>
+    </w:lvl>
+    <w:lvl w:ilvl="2">
+      <w:start w:val="1"/>
+      <w:numFmt w:val="decimal"/>
+      <w:lvlText w:val="%1.%2.%3"/>
+      <w:lvlJc w:val="left"/>
+      <w:pPr>
+        <w:ind w:left="720" w:hanging="720"/>
+      </w:pPr>
+      <w:rPr>
+        <w:rFonts w:hint="default"/>
+      </w:rPr>
+    </w:lvl>
+    <w:lvl w:ilvl="3">
+      <w:start w:val="1"/>
+      <w:numFmt w:val="decimal"/>
+      <w:lvlText w:val="%1.%2.%3.%4"/>
+      <w:lvlJc w:val="left"/>
+      <w:pPr>
+        <w:ind w:left="720" w:hanging="720"/>
+      </w:pPr>
+      <w:rPr>
+        <w:rFonts w:hint="default"/>
+      </w:rPr>
+    </w:lvl>
+    <w:lvl w:ilvl="4">
+      <w:start w:val="1"/>
+      <w:numFmt w:val="decimal"/>
+      <w:lvlText w:val="%1.%2.%3.%4.%5"/>
+      <w:lvlJc w:val="left"/>
+      <w:pPr>
+        <w:ind w:left="1080" w:hanging="1080"/>
+      </w:pPr>
+      <w:rPr>
+        <w:rFonts w:hint="default"/>
+      </w:rPr>
+    </w:lvl>
+    <w:lvl w:ilvl="5">
+      <w:start w:val="1"/>
+      <w:numFmt w:val="decimal"/>
+      <w:lvlText w:val="%1.%2.%3.%4.%5.%6"/>
+      <w:lvlJc w:val="left"/>
+      <w:pPr>
+        <w:ind w:left="1080" w:hanging="1080"/>
+      </w:pPr>
+      <w:rPr>
+        <w:rFonts w:hint="default"/>
+      </w:rPr>
+    </w:lvl>
+    <w:lvl w:ilvl="6">
+      <w:start w:val="1"/>
+      <w:numFmt w:val="decimal"/>
+      <w:lvlText w:val="%1.%2.%3.%4.%5.%6.%7"/>
+      <w:lvlJc w:val="left"/>
+      <w:pPr>
+        <w:ind w:left="1440" w:hanging="1440"/>
+      </w:pPr>
+      <w:rPr>
+        <w:rFonts w:hint="default"/>
+      </w:rPr>
+    </w:lvl>
+    <w:lvl w:ilvl="7">
+      <w:start w:val="1"/>
+      <w:numFmt w:val="decimal"/>
+      <w:lvlText w:val="%1.%2.%3.%4.%5.%6.%7.%8"/>
+      <w:lvlJc w:val="left"/>
+      <w:pPr>
+        <w:ind w:left="1440" w:hanging="1440"/>
+      </w:pPr>
+      <w:rPr>
+        <w:rFonts w:hint="default"/>
+      </w:rPr>
+    </w:lvl>
+    <w:lvl w:ilvl="8">
+      <w:start w:val="1"/>
+      <w:numFmt w:val="decimal"/>
+      <w:lvlText w:val="%1.%2.%3.%4.%5.%6.%7.%8.%9"/>
+      <w:lvlJc w:val="left"/>
+      <w:pPr>
+        <w:ind w:left="1800" w:hanging="1800"/>
+      </w:pPr>
+      <w:rPr>
+        <w:rFonts w:hint="default"/>
+      </w:rPr>
+    </w:lvl>
+  </w:abstractNum>
+  <w:abstractNum w:abstractNumId="15" w15:restartNumberingAfterBreak="0">
     <w:nsid w:val="48150A34"/>
     <w:multiLevelType w:val="hybridMultilevel"/>
     <w:tmpl w:val="739CC4E0"/>
@@ -8227,7 +8651,7 @@
       </w:rPr>
     </w:lvl>
   </w:abstractNum>
-  <w:abstractNum w:abstractNumId="14" w15:restartNumberingAfterBreak="0">
+  <w:abstractNum w:abstractNumId="16" w15:restartNumberingAfterBreak="0">
     <w:nsid w:val="4CFC334E"/>
     <w:multiLevelType w:val="multilevel"/>
     <w:tmpl w:val="5C88505C"/>
@@ -8340,7 +8764,7 @@
       </w:rPr>
     </w:lvl>
   </w:abstractNum>
-  <w:abstractNum w:abstractNumId="15" w15:restartNumberingAfterBreak="0">
+  <w:abstractNum w:abstractNumId="17" w15:restartNumberingAfterBreak="0">
     <w:nsid w:val="5C241D34"/>
     <w:multiLevelType w:val="multilevel"/>
     <w:tmpl w:val="85E29472"/>
@@ -8453,7 +8877,7 @@
       </w:rPr>
     </w:lvl>
   </w:abstractNum>
-  <w:abstractNum w:abstractNumId="16" w15:restartNumberingAfterBreak="0">
+  <w:abstractNum w:abstractNumId="18" w15:restartNumberingAfterBreak="0">
     <w:nsid w:val="5CCC508F"/>
     <w:multiLevelType w:val="multilevel"/>
     <w:tmpl w:val="5C88505C"/>
@@ -8566,7 +8990,7 @@
       </w:rPr>
     </w:lvl>
   </w:abstractNum>
-  <w:abstractNum w:abstractNumId="17" w15:restartNumberingAfterBreak="0">
+  <w:abstractNum w:abstractNumId="19" w15:restartNumberingAfterBreak="0">
     <w:nsid w:val="6045026A"/>
     <w:multiLevelType w:val="hybridMultilevel"/>
     <w:tmpl w:val="B64C08B0"/>
@@ -8679,7 +9103,7 @@
       </w:rPr>
     </w:lvl>
   </w:abstractNum>
-  <w:abstractNum w:abstractNumId="18" w15:restartNumberingAfterBreak="0">
+  <w:abstractNum w:abstractNumId="20" w15:restartNumberingAfterBreak="0">
     <w:nsid w:val="6B4A4C5D"/>
     <w:multiLevelType w:val="hybridMultilevel"/>
     <w:tmpl w:val="A5620E18"/>
@@ -8792,7 +9216,7 @@
       </w:rPr>
     </w:lvl>
   </w:abstractNum>
-  <w:abstractNum w:abstractNumId="19" w15:restartNumberingAfterBreak="0">
+  <w:abstractNum w:abstractNumId="21" w15:restartNumberingAfterBreak="0">
     <w:nsid w:val="74ED718B"/>
     <w:multiLevelType w:val="multilevel"/>
     <w:tmpl w:val="5C88505C"/>
@@ -8905,65 +9329,187 @@
       </w:rPr>
     </w:lvl>
   </w:abstractNum>
+  <w:abstractNum w:abstractNumId="22" w15:restartNumberingAfterBreak="0">
+    <w:nsid w:val="75BF6202"/>
+    <w:multiLevelType w:val="multilevel"/>
+    <w:tmpl w:val="85E29472"/>
+    <w:lvl w:ilvl="0">
+      <w:start w:val="1"/>
+      <w:numFmt w:val="decimal"/>
+      <w:lvlText w:val="%1"/>
+      <w:lvlJc w:val="left"/>
+      <w:pPr>
+        <w:ind w:left="360" w:hanging="360"/>
+      </w:pPr>
+      <w:rPr>
+        <w:rFonts w:hint="default"/>
+      </w:rPr>
+    </w:lvl>
+    <w:lvl w:ilvl="1">
+      <w:start w:val="1"/>
+      <w:numFmt w:val="decimal"/>
+      <w:lvlText w:val="%1.%2"/>
+      <w:lvlJc w:val="left"/>
+      <w:pPr>
+        <w:ind w:left="360" w:hanging="360"/>
+      </w:pPr>
+      <w:rPr>
+        <w:rFonts w:hint="default"/>
+      </w:rPr>
+    </w:lvl>
+    <w:lvl w:ilvl="2">
+      <w:start w:val="1"/>
+      <w:numFmt w:val="decimal"/>
+      <w:lvlText w:val="%1.%2.%3"/>
+      <w:lvlJc w:val="left"/>
+      <w:pPr>
+        <w:ind w:left="720" w:hanging="720"/>
+      </w:pPr>
+      <w:rPr>
+        <w:rFonts w:hint="default"/>
+      </w:rPr>
+    </w:lvl>
+    <w:lvl w:ilvl="3">
+      <w:start w:val="1"/>
+      <w:numFmt w:val="decimal"/>
+      <w:lvlText w:val="%1.%2.%3.%4"/>
+      <w:lvlJc w:val="left"/>
+      <w:pPr>
+        <w:ind w:left="720" w:hanging="720"/>
+      </w:pPr>
+      <w:rPr>
+        <w:rFonts w:hint="default"/>
+      </w:rPr>
+    </w:lvl>
+    <w:lvl w:ilvl="4">
+      <w:start w:val="1"/>
+      <w:numFmt w:val="decimal"/>
+      <w:lvlText w:val="%1.%2.%3.%4.%5"/>
+      <w:lvlJc w:val="left"/>
+      <w:pPr>
+        <w:ind w:left="1080" w:hanging="1080"/>
+      </w:pPr>
+      <w:rPr>
+        <w:rFonts w:hint="default"/>
+      </w:rPr>
+    </w:lvl>
+    <w:lvl w:ilvl="5">
+      <w:start w:val="1"/>
+      <w:numFmt w:val="decimal"/>
+      <w:lvlText w:val="%1.%2.%3.%4.%5.%6"/>
+      <w:lvlJc w:val="left"/>
+      <w:pPr>
+        <w:ind w:left="1080" w:hanging="1080"/>
+      </w:pPr>
+      <w:rPr>
+        <w:rFonts w:hint="default"/>
+      </w:rPr>
+    </w:lvl>
+    <w:lvl w:ilvl="6">
+      <w:start w:val="1"/>
+      <w:numFmt w:val="decimal"/>
+      <w:lvlText w:val="%1.%2.%3.%4.%5.%6.%7"/>
+      <w:lvlJc w:val="left"/>
+      <w:pPr>
+        <w:ind w:left="1440" w:hanging="1440"/>
+      </w:pPr>
+      <w:rPr>
+        <w:rFonts w:hint="default"/>
+      </w:rPr>
+    </w:lvl>
+    <w:lvl w:ilvl="7">
+      <w:start w:val="1"/>
+      <w:numFmt w:val="decimal"/>
+      <w:lvlText w:val="%1.%2.%3.%4.%5.%6.%7.%8"/>
+      <w:lvlJc w:val="left"/>
+      <w:pPr>
+        <w:ind w:left="1440" w:hanging="1440"/>
+      </w:pPr>
+      <w:rPr>
+        <w:rFonts w:hint="default"/>
+      </w:rPr>
+    </w:lvl>
+    <w:lvl w:ilvl="8">
+      <w:start w:val="1"/>
+      <w:numFmt w:val="decimal"/>
+      <w:lvlText w:val="%1.%2.%3.%4.%5.%6.%7.%8.%9"/>
+      <w:lvlJc w:val="left"/>
+      <w:pPr>
+        <w:ind w:left="1800" w:hanging="1800"/>
+      </w:pPr>
+      <w:rPr>
+        <w:rFonts w:hint="default"/>
+      </w:rPr>
+    </w:lvl>
+  </w:abstractNum>
   <w:num w:numId="1" w16cid:durableId="312686028">
+    <w:abstractNumId w:val="10"/>
+  </w:num>
+  <w:num w:numId="2" w16cid:durableId="208148126">
+    <w:abstractNumId w:val="13"/>
+  </w:num>
+  <w:num w:numId="3" w16cid:durableId="99180699">
+    <w:abstractNumId w:val="12"/>
+  </w:num>
+  <w:num w:numId="4" w16cid:durableId="1058818331">
+    <w:abstractNumId w:val="8"/>
+  </w:num>
+  <w:num w:numId="5" w16cid:durableId="334961499">
+    <w:abstractNumId w:val="6"/>
+  </w:num>
+  <w:num w:numId="6" w16cid:durableId="749742647">
     <w:abstractNumId w:val="9"/>
   </w:num>
-  <w:num w:numId="2" w16cid:durableId="208148126">
-    <w:abstractNumId w:val="12"/>
-  </w:num>
-  <w:num w:numId="3" w16cid:durableId="99180699">
+  <w:num w:numId="7" w16cid:durableId="1618835601">
     <w:abstractNumId w:val="11"/>
   </w:num>
-  <w:num w:numId="4" w16cid:durableId="1058818331">
-    <w:abstractNumId w:val="7"/>
-  </w:num>
-  <w:num w:numId="5" w16cid:durableId="334961499">
-    <w:abstractNumId w:val="5"/>
-  </w:num>
-  <w:num w:numId="6" w16cid:durableId="749742647">
-    <w:abstractNumId w:val="8"/>
-  </w:num>
-  <w:num w:numId="7" w16cid:durableId="1618835601">
-    <w:abstractNumId w:val="10"/>
-  </w:num>
   <w:num w:numId="8" w16cid:durableId="1765035498">
-    <w:abstractNumId w:val="17"/>
+    <w:abstractNumId w:val="19"/>
   </w:num>
   <w:num w:numId="9" w16cid:durableId="1410232914">
+    <w:abstractNumId w:val="4"/>
+  </w:num>
+  <w:num w:numId="10" w16cid:durableId="1004362059">
+    <w:abstractNumId w:val="20"/>
+  </w:num>
+  <w:num w:numId="11" w16cid:durableId="47271280">
     <w:abstractNumId w:val="3"/>
   </w:num>
-  <w:num w:numId="10" w16cid:durableId="1004362059">
-    <w:abstractNumId w:val="18"/>
-  </w:num>
-  <w:num w:numId="11" w16cid:durableId="47271280">
-    <w:abstractNumId w:val="2"/>
-  </w:num>
   <w:num w:numId="12" w16cid:durableId="34081203">
-    <w:abstractNumId w:val="13"/>
+    <w:abstractNumId w:val="15"/>
   </w:num>
   <w:num w:numId="13" w16cid:durableId="1821582245">
-    <w:abstractNumId w:val="6"/>
+    <w:abstractNumId w:val="7"/>
   </w:num>
   <w:num w:numId="14" w16cid:durableId="1434201224">
     <w:abstractNumId w:val="0"/>
   </w:num>
   <w:num w:numId="15" w16cid:durableId="20324119">
-    <w:abstractNumId w:val="4"/>
+    <w:abstractNumId w:val="5"/>
   </w:num>
   <w:num w:numId="16" w16cid:durableId="1866013673">
-    <w:abstractNumId w:val="14"/>
+    <w:abstractNumId w:val="16"/>
   </w:num>
   <w:num w:numId="17" w16cid:durableId="651719968">
-    <w:abstractNumId w:val="19"/>
+    <w:abstractNumId w:val="21"/>
   </w:num>
   <w:num w:numId="18" w16cid:durableId="1037774367">
-    <w:abstractNumId w:val="16"/>
+    <w:abstractNumId w:val="18"/>
   </w:num>
   <w:num w:numId="19" w16cid:durableId="896356697">
     <w:abstractNumId w:val="1"/>
   </w:num>
   <w:num w:numId="20" w16cid:durableId="298070152">
-    <w:abstractNumId w:val="15"/>
+    <w:abstractNumId w:val="17"/>
+  </w:num>
+  <w:num w:numId="21" w16cid:durableId="907612493">
+    <w:abstractNumId w:val="22"/>
+  </w:num>
+  <w:num w:numId="22" w16cid:durableId="1268581924">
+    <w:abstractNumId w:val="2"/>
+  </w:num>
+  <w:num w:numId="23" w16cid:durableId="1165973796">
+    <w:abstractNumId w:val="14"/>
   </w:num>
 </w:numbering>
 </file>

</xml_diff>

<commit_message>
cap2: comienza sección de brecha de investigación
</commit_message>
<xml_diff>
--- a/docs/Capítulo 2.docx
+++ b/docs/Capítulo 2.docx
@@ -537,8 +537,7 @@
     </w:p>
     <w:p>
       <w:pPr>
-        <w:ind w:left="2074" w:right="1908"/>
-        <w:jc w:val="center"/>
+        <w:ind w:right="1908"/>
         <w:rPr>
           <w:rFonts w:ascii="Times New Roman" w:hAnsi="Times New Roman" w:cs="Times New Roman"/>
           <w:sz w:val="20"/>
@@ -579,7 +578,7 @@
       </w:pPr>
       <w:bookmarkStart w:id="1" w:name="_Toc474331175"/>
       <w:bookmarkStart w:id="2" w:name="_Toc474331374"/>
-      <w:bookmarkStart w:id="3" w:name="_Toc232546702"/>
+      <w:bookmarkStart w:id="3" w:name="_Toc232549394"/>
       <w:commentRangeStart w:id="4"/>
       <w:r>
         <w:lastRenderedPageBreak/>
@@ -619,7 +618,7 @@
       <w:r>
         <w:fldChar w:fldCharType="separate"/>
       </w:r>
-      <w:hyperlink w:anchor="_Toc232546702" w:history="1">
+      <w:hyperlink w:anchor="_Toc232549394" w:history="1">
         <w:r>
           <w:rPr>
             <w:rStyle w:val="Hyperlink"/>
@@ -646,7 +645,7 @@
             <w:noProof/>
             <w:webHidden/>
           </w:rPr>
-          <w:instrText xml:space="preserve"> PAGEREF _Toc232546702 \h </w:instrText>
+          <w:instrText xml:space="preserve"> PAGEREF _Toc232549394 \h </w:instrText>
         </w:r>
         <w:r>
           <w:rPr>
@@ -689,7 +688,7 @@
           <w14:ligatures w14:val="standardContextual"/>
         </w:rPr>
       </w:pPr>
-      <w:hyperlink w:anchor="_Toc232546703" w:history="1">
+      <w:hyperlink w:anchor="_Toc232549395" w:history="1">
         <w:r>
           <w:rPr>
             <w:rStyle w:val="Hyperlink"/>
@@ -716,7 +715,7 @@
             <w:noProof/>
             <w:webHidden/>
           </w:rPr>
-          <w:instrText xml:space="preserve"> PAGEREF _Toc232546703 \h </w:instrText>
+          <w:instrText xml:space="preserve"> PAGEREF _Toc232549395 \h </w:instrText>
         </w:r>
         <w:r>
           <w:rPr>
@@ -763,7 +762,7 @@
           <w14:ligatures w14:val="standardContextual"/>
         </w:rPr>
       </w:pPr>
-      <w:hyperlink w:anchor="_Toc232546704" w:history="1">
+      <w:hyperlink w:anchor="_Toc232549396" w:history="1">
         <w:r>
           <w:rPr>
             <w:rStyle w:val="Hyperlink"/>
@@ -808,7 +807,7 @@
             <w:noProof/>
             <w:webHidden/>
           </w:rPr>
-          <w:instrText xml:space="preserve"> PAGEREF _Toc232546704 \h </w:instrText>
+          <w:instrText xml:space="preserve"> PAGEREF _Toc232549396 \h </w:instrText>
         </w:r>
         <w:r>
           <w:rPr>
@@ -855,7 +854,7 @@
           <w14:ligatures w14:val="standardContextual"/>
         </w:rPr>
       </w:pPr>
-      <w:hyperlink w:anchor="_Toc232546705" w:history="1">
+      <w:hyperlink w:anchor="_Toc232549397" w:history="1">
         <w:r>
           <w:rPr>
             <w:rStyle w:val="Hyperlink"/>
@@ -902,7 +901,7 @@
             <w:noProof/>
             <w:webHidden/>
           </w:rPr>
-          <w:instrText xml:space="preserve"> PAGEREF _Toc232546705 \h </w:instrText>
+          <w:instrText xml:space="preserve"> PAGEREF _Toc232549397 \h </w:instrText>
         </w:r>
         <w:r>
           <w:rPr>
@@ -949,7 +948,7 @@
           <w14:ligatures w14:val="standardContextual"/>
         </w:rPr>
       </w:pPr>
-      <w:hyperlink w:anchor="_Toc232546706" w:history="1">
+      <w:hyperlink w:anchor="_Toc232549398" w:history="1">
         <w:r>
           <w:rPr>
             <w:rStyle w:val="Hyperlink"/>
@@ -996,7 +995,7 @@
             <w:noProof/>
             <w:webHidden/>
           </w:rPr>
-          <w:instrText xml:space="preserve"> PAGEREF _Toc232546706 \h </w:instrText>
+          <w:instrText xml:space="preserve"> PAGEREF _Toc232549398 \h </w:instrText>
         </w:r>
         <w:r>
           <w:rPr>
@@ -1043,7 +1042,7 @@
           <w14:ligatures w14:val="standardContextual"/>
         </w:rPr>
       </w:pPr>
-      <w:hyperlink w:anchor="_Toc232546707" w:history="1">
+      <w:hyperlink w:anchor="_Toc232549399" w:history="1">
         <w:r>
           <w:rPr>
             <w:rStyle w:val="Hyperlink"/>
@@ -1090,7 +1089,7 @@
             <w:noProof/>
             <w:webHidden/>
           </w:rPr>
-          <w:instrText xml:space="preserve"> PAGEREF _Toc232546707 \h </w:instrText>
+          <w:instrText xml:space="preserve"> PAGEREF _Toc232549399 \h </w:instrText>
         </w:r>
         <w:r>
           <w:rPr>
@@ -1137,7 +1136,7 @@
           <w14:ligatures w14:val="standardContextual"/>
         </w:rPr>
       </w:pPr>
-      <w:hyperlink w:anchor="_Toc232546708" w:history="1">
+      <w:hyperlink w:anchor="_Toc232549400" w:history="1">
         <w:r>
           <w:rPr>
             <w:rStyle w:val="Hyperlink"/>
@@ -1184,7 +1183,7 @@
             <w:noProof/>
             <w:webHidden/>
           </w:rPr>
-          <w:instrText xml:space="preserve"> PAGEREF _Toc232546708 \h </w:instrText>
+          <w:instrText xml:space="preserve"> PAGEREF _Toc232549400 \h </w:instrText>
         </w:r>
         <w:r>
           <w:rPr>
@@ -1231,7 +1230,7 @@
           <w14:ligatures w14:val="standardContextual"/>
         </w:rPr>
       </w:pPr>
-      <w:hyperlink w:anchor="_Toc232546709" w:history="1">
+      <w:hyperlink w:anchor="_Toc232549401" w:history="1">
         <w:r>
           <w:rPr>
             <w:rStyle w:val="Hyperlink"/>
@@ -1278,7 +1277,7 @@
             <w:noProof/>
             <w:webHidden/>
           </w:rPr>
-          <w:instrText xml:space="preserve"> PAGEREF _Toc232546709 \h </w:instrText>
+          <w:instrText xml:space="preserve"> PAGEREF _Toc232549401 \h </w:instrText>
         </w:r>
         <w:r>
           <w:rPr>
@@ -1325,7 +1324,7 @@
           <w14:ligatures w14:val="standardContextual"/>
         </w:rPr>
       </w:pPr>
-      <w:hyperlink w:anchor="_Toc232546710" w:history="1">
+      <w:hyperlink w:anchor="_Toc232549402" w:history="1">
         <w:r>
           <w:rPr>
             <w:rStyle w:val="Hyperlink"/>
@@ -1372,7 +1371,7 @@
             <w:noProof/>
             <w:webHidden/>
           </w:rPr>
-          <w:instrText xml:space="preserve"> PAGEREF _Toc232546710 \h </w:instrText>
+          <w:instrText xml:space="preserve"> PAGEREF _Toc232549402 \h </w:instrText>
         </w:r>
         <w:r>
           <w:rPr>
@@ -1419,7 +1418,7 @@
           <w14:ligatures w14:val="standardContextual"/>
         </w:rPr>
       </w:pPr>
-      <w:hyperlink w:anchor="_Toc232546711" w:history="1">
+      <w:hyperlink w:anchor="_Toc232549403" w:history="1">
         <w:r>
           <w:rPr>
             <w:rStyle w:val="Hyperlink"/>
@@ -1466,7 +1465,7 @@
             <w:noProof/>
             <w:webHidden/>
           </w:rPr>
-          <w:instrText xml:space="preserve"> PAGEREF _Toc232546711 \h </w:instrText>
+          <w:instrText xml:space="preserve"> PAGEREF _Toc232549403 \h </w:instrText>
         </w:r>
         <w:r>
           <w:rPr>
@@ -1513,7 +1512,7 @@
           <w14:ligatures w14:val="standardContextual"/>
         </w:rPr>
       </w:pPr>
-      <w:hyperlink w:anchor="_Toc232546712" w:history="1">
+      <w:hyperlink w:anchor="_Toc232549404" w:history="1">
         <w:r>
           <w:rPr>
             <w:rStyle w:val="Hyperlink"/>
@@ -1560,7 +1559,7 @@
             <w:noProof/>
             <w:webHidden/>
           </w:rPr>
-          <w:instrText xml:space="preserve"> PAGEREF _Toc232546712 \h </w:instrText>
+          <w:instrText xml:space="preserve"> PAGEREF _Toc232549404 \h </w:instrText>
         </w:r>
         <w:r>
           <w:rPr>
@@ -1607,7 +1606,7 @@
           <w14:ligatures w14:val="standardContextual"/>
         </w:rPr>
       </w:pPr>
-      <w:hyperlink w:anchor="_Toc232546713" w:history="1">
+      <w:hyperlink w:anchor="_Toc232549405" w:history="1">
         <w:r>
           <w:rPr>
             <w:rStyle w:val="Hyperlink"/>
@@ -1654,7 +1653,7 @@
             <w:noProof/>
             <w:webHidden/>
           </w:rPr>
-          <w:instrText xml:space="preserve"> PAGEREF _Toc232546713 \h </w:instrText>
+          <w:instrText xml:space="preserve"> PAGEREF _Toc232549405 \h </w:instrText>
         </w:r>
         <w:r>
           <w:rPr>
@@ -1701,7 +1700,7 @@
           <w14:ligatures w14:val="standardContextual"/>
         </w:rPr>
       </w:pPr>
-      <w:hyperlink w:anchor="_Toc232546714" w:history="1">
+      <w:hyperlink w:anchor="_Toc232549406" w:history="1">
         <w:r>
           <w:rPr>
             <w:rStyle w:val="Hyperlink"/>
@@ -1748,7 +1747,7 @@
             <w:noProof/>
             <w:webHidden/>
           </w:rPr>
-          <w:instrText xml:space="preserve"> PAGEREF _Toc232546714 \h </w:instrText>
+          <w:instrText xml:space="preserve"> PAGEREF _Toc232549406 \h </w:instrText>
         </w:r>
         <w:r>
           <w:rPr>
@@ -1795,7 +1794,7 @@
           <w14:ligatures w14:val="standardContextual"/>
         </w:rPr>
       </w:pPr>
-      <w:hyperlink w:anchor="_Toc232546715" w:history="1">
+      <w:hyperlink w:anchor="_Toc232549407" w:history="1">
         <w:r>
           <w:rPr>
             <w:rStyle w:val="Hyperlink"/>
@@ -1842,7 +1841,7 @@
             <w:noProof/>
             <w:webHidden/>
           </w:rPr>
-          <w:instrText xml:space="preserve"> PAGEREF _Toc232546715 \h </w:instrText>
+          <w:instrText xml:space="preserve"> PAGEREF _Toc232549407 \h </w:instrText>
         </w:r>
         <w:r>
           <w:rPr>
@@ -1889,7 +1888,7 @@
           <w14:ligatures w14:val="standardContextual"/>
         </w:rPr>
       </w:pPr>
-      <w:hyperlink w:anchor="_Toc232546716" w:history="1">
+      <w:hyperlink w:anchor="_Toc232549408" w:history="1">
         <w:r>
           <w:rPr>
             <w:rStyle w:val="Hyperlink"/>
@@ -1936,7 +1935,7 @@
             <w:noProof/>
             <w:webHidden/>
           </w:rPr>
-          <w:instrText xml:space="preserve"> PAGEREF _Toc232546716 \h </w:instrText>
+          <w:instrText xml:space="preserve"> PAGEREF _Toc232549408 \h </w:instrText>
         </w:r>
         <w:r>
           <w:rPr>
@@ -1983,7 +1982,7 @@
           <w14:ligatures w14:val="standardContextual"/>
         </w:rPr>
       </w:pPr>
-      <w:hyperlink w:anchor="_Toc232546717" w:history="1">
+      <w:hyperlink w:anchor="_Toc232549409" w:history="1">
         <w:r>
           <w:rPr>
             <w:rStyle w:val="Hyperlink"/>
@@ -2030,7 +2029,7 @@
             <w:noProof/>
             <w:webHidden/>
           </w:rPr>
-          <w:instrText xml:space="preserve"> PAGEREF _Toc232546717 \h </w:instrText>
+          <w:instrText xml:space="preserve"> PAGEREF _Toc232549409 \h </w:instrText>
         </w:r>
         <w:r>
           <w:rPr>
@@ -2077,7 +2076,7 @@
           <w14:ligatures w14:val="standardContextual"/>
         </w:rPr>
       </w:pPr>
-      <w:hyperlink w:anchor="_Toc232546718" w:history="1">
+      <w:hyperlink w:anchor="_Toc232549410" w:history="1">
         <w:r>
           <w:rPr>
             <w:rStyle w:val="Hyperlink"/>
@@ -2124,7 +2123,7 @@
             <w:noProof/>
             <w:webHidden/>
           </w:rPr>
-          <w:instrText xml:space="preserve"> PAGEREF _Toc232546718 \h </w:instrText>
+          <w:instrText xml:space="preserve"> PAGEREF _Toc232549410 \h </w:instrText>
         </w:r>
         <w:r>
           <w:rPr>
@@ -2171,7 +2170,7 @@
           <w14:ligatures w14:val="standardContextual"/>
         </w:rPr>
       </w:pPr>
-      <w:hyperlink w:anchor="_Toc232546719" w:history="1">
+      <w:hyperlink w:anchor="_Toc232549411" w:history="1">
         <w:r>
           <w:rPr>
             <w:rStyle w:val="Hyperlink"/>
@@ -2218,7 +2217,7 @@
             <w:noProof/>
             <w:webHidden/>
           </w:rPr>
-          <w:instrText xml:space="preserve"> PAGEREF _Toc232546719 \h </w:instrText>
+          <w:instrText xml:space="preserve"> PAGEREF _Toc232549411 \h </w:instrText>
         </w:r>
         <w:r>
           <w:rPr>
@@ -2265,7 +2264,7 @@
           <w14:ligatures w14:val="standardContextual"/>
         </w:rPr>
       </w:pPr>
-      <w:hyperlink w:anchor="_Toc232546720" w:history="1">
+      <w:hyperlink w:anchor="_Toc232549412" w:history="1">
         <w:r>
           <w:rPr>
             <w:rStyle w:val="Hyperlink"/>
@@ -2312,7 +2311,7 @@
             <w:noProof/>
             <w:webHidden/>
           </w:rPr>
-          <w:instrText xml:space="preserve"> PAGEREF _Toc232546720 \h </w:instrText>
+          <w:instrText xml:space="preserve"> PAGEREF _Toc232549412 \h </w:instrText>
         </w:r>
         <w:r>
           <w:rPr>
@@ -2359,7 +2358,7 @@
           <w14:ligatures w14:val="standardContextual"/>
         </w:rPr>
       </w:pPr>
-      <w:hyperlink w:anchor="_Toc232546721" w:history="1">
+      <w:hyperlink w:anchor="_Toc232549413" w:history="1">
         <w:r>
           <w:rPr>
             <w:rStyle w:val="Hyperlink"/>
@@ -2406,7 +2405,7 @@
             <w:noProof/>
             <w:webHidden/>
           </w:rPr>
-          <w:instrText xml:space="preserve"> PAGEREF _Toc232546721 \h </w:instrText>
+          <w:instrText xml:space="preserve"> PAGEREF _Toc232549413 \h </w:instrText>
         </w:r>
         <w:r>
           <w:rPr>
@@ -2453,7 +2452,7 @@
           <w14:ligatures w14:val="standardContextual"/>
         </w:rPr>
       </w:pPr>
-      <w:hyperlink w:anchor="_Toc232546722" w:history="1">
+      <w:hyperlink w:anchor="_Toc232549414" w:history="1">
         <w:r>
           <w:rPr>
             <w:rStyle w:val="Hyperlink"/>
@@ -2500,7 +2499,7 @@
             <w:noProof/>
             <w:webHidden/>
           </w:rPr>
-          <w:instrText xml:space="preserve"> PAGEREF _Toc232546722 \h </w:instrText>
+          <w:instrText xml:space="preserve"> PAGEREF _Toc232549414 \h </w:instrText>
         </w:r>
         <w:r>
           <w:rPr>
@@ -2547,7 +2546,7 @@
           <w14:ligatures w14:val="standardContextual"/>
         </w:rPr>
       </w:pPr>
-      <w:hyperlink w:anchor="_Toc232546723" w:history="1">
+      <w:hyperlink w:anchor="_Toc232549415" w:history="1">
         <w:r>
           <w:rPr>
             <w:rStyle w:val="Hyperlink"/>
@@ -2594,7 +2593,7 @@
             <w:noProof/>
             <w:webHidden/>
           </w:rPr>
-          <w:instrText xml:space="preserve"> PAGEREF _Toc232546723 \h </w:instrText>
+          <w:instrText xml:space="preserve"> PAGEREF _Toc232549415 \h </w:instrText>
         </w:r>
         <w:r>
           <w:rPr>
@@ -2641,7 +2640,7 @@
           <w14:ligatures w14:val="standardContextual"/>
         </w:rPr>
       </w:pPr>
-      <w:hyperlink w:anchor="_Toc232546724" w:history="1">
+      <w:hyperlink w:anchor="_Toc232549416" w:history="1">
         <w:r>
           <w:rPr>
             <w:rStyle w:val="Hyperlink"/>
@@ -2688,7 +2687,7 @@
             <w:noProof/>
             <w:webHidden/>
           </w:rPr>
-          <w:instrText xml:space="preserve"> PAGEREF _Toc232546724 \h </w:instrText>
+          <w:instrText xml:space="preserve"> PAGEREF _Toc232549416 \h </w:instrText>
         </w:r>
         <w:r>
           <w:rPr>
@@ -2735,7 +2734,7 @@
           <w14:ligatures w14:val="standardContextual"/>
         </w:rPr>
       </w:pPr>
-      <w:hyperlink w:anchor="_Toc232546725" w:history="1">
+      <w:hyperlink w:anchor="_Toc232549417" w:history="1">
         <w:r>
           <w:rPr>
             <w:rStyle w:val="Hyperlink"/>
@@ -2782,7 +2781,7 @@
             <w:noProof/>
             <w:webHidden/>
           </w:rPr>
-          <w:instrText xml:space="preserve"> PAGEREF _Toc232546725 \h </w:instrText>
+          <w:instrText xml:space="preserve"> PAGEREF _Toc232549417 \h </w:instrText>
         </w:r>
         <w:r>
           <w:rPr>
@@ -2829,7 +2828,7 @@
           <w14:ligatures w14:val="standardContextual"/>
         </w:rPr>
       </w:pPr>
-      <w:hyperlink w:anchor="_Toc232546726" w:history="1">
+      <w:hyperlink w:anchor="_Toc232549418" w:history="1">
         <w:r>
           <w:rPr>
             <w:rStyle w:val="Hyperlink"/>
@@ -2876,7 +2875,7 @@
             <w:noProof/>
             <w:webHidden/>
           </w:rPr>
-          <w:instrText xml:space="preserve"> PAGEREF _Toc232546726 \h </w:instrText>
+          <w:instrText xml:space="preserve"> PAGEREF _Toc232549418 \h </w:instrText>
         </w:r>
         <w:r>
           <w:rPr>
@@ -2919,7 +2918,7 @@
           <w14:ligatures w14:val="standardContextual"/>
         </w:rPr>
       </w:pPr>
-      <w:hyperlink w:anchor="_Toc232546727" w:history="1">
+      <w:hyperlink w:anchor="_Toc232549419" w:history="1">
         <w:r>
           <w:rPr>
             <w:rStyle w:val="Hyperlink"/>
@@ -2946,7 +2945,7 @@
             <w:noProof/>
             <w:webHidden/>
           </w:rPr>
-          <w:instrText xml:space="preserve"> PAGEREF _Toc232546727 \h </w:instrText>
+          <w:instrText xml:space="preserve"> PAGEREF _Toc232549419 \h </w:instrText>
         </w:r>
         <w:r>
           <w:rPr>
@@ -2993,7 +2992,7 @@
           <w14:ligatures w14:val="standardContextual"/>
         </w:rPr>
       </w:pPr>
-      <w:hyperlink w:anchor="_Toc232546728" w:history="1">
+      <w:hyperlink w:anchor="_Toc232549420" w:history="1">
         <w:r>
           <w:rPr>
             <w:rStyle w:val="Hyperlink"/>
@@ -3040,7 +3039,7 @@
             <w:noProof/>
             <w:webHidden/>
           </w:rPr>
-          <w:instrText xml:space="preserve"> PAGEREF _Toc232546728 \h </w:instrText>
+          <w:instrText xml:space="preserve"> PAGEREF _Toc232549420 \h </w:instrText>
         </w:r>
         <w:r>
           <w:rPr>
@@ -3087,7 +3086,7 @@
           <w14:ligatures w14:val="standardContextual"/>
         </w:rPr>
       </w:pPr>
-      <w:hyperlink w:anchor="_Toc232546729" w:history="1">
+      <w:hyperlink w:anchor="_Toc232549421" w:history="1">
         <w:r>
           <w:rPr>
             <w:rStyle w:val="Hyperlink"/>
@@ -3134,7 +3133,7 @@
             <w:noProof/>
             <w:webHidden/>
           </w:rPr>
-          <w:instrText xml:space="preserve"> PAGEREF _Toc232546729 \h </w:instrText>
+          <w:instrText xml:space="preserve"> PAGEREF _Toc232549421 \h </w:instrText>
         </w:r>
         <w:r>
           <w:rPr>
@@ -3181,7 +3180,7 @@
           <w14:ligatures w14:val="standardContextual"/>
         </w:rPr>
       </w:pPr>
-      <w:hyperlink w:anchor="_Toc232546730" w:history="1">
+      <w:hyperlink w:anchor="_Toc232549422" w:history="1">
         <w:r>
           <w:rPr>
             <w:rStyle w:val="Hyperlink"/>
@@ -3228,7 +3227,7 @@
             <w:noProof/>
             <w:webHidden/>
           </w:rPr>
-          <w:instrText xml:space="preserve"> PAGEREF _Toc232546730 \h </w:instrText>
+          <w:instrText xml:space="preserve"> PAGEREF _Toc232549422 \h </w:instrText>
         </w:r>
         <w:r>
           <w:rPr>
@@ -3275,7 +3274,7 @@
           <w14:ligatures w14:val="standardContextual"/>
         </w:rPr>
       </w:pPr>
-      <w:hyperlink w:anchor="_Toc232546735" w:history="1">
+      <w:hyperlink w:anchor="_Toc232549427" w:history="1">
         <w:r>
           <w:rPr>
             <w:rStyle w:val="Hyperlink"/>
@@ -3322,7 +3321,7 @@
             <w:noProof/>
             <w:webHidden/>
           </w:rPr>
-          <w:instrText xml:space="preserve"> PAGEREF _Toc232546735 \h </w:instrText>
+          <w:instrText xml:space="preserve"> PAGEREF _Toc232549427 \h </w:instrText>
         </w:r>
         <w:r>
           <w:rPr>
@@ -3369,7 +3368,7 @@
           <w14:ligatures w14:val="standardContextual"/>
         </w:rPr>
       </w:pPr>
-      <w:hyperlink w:anchor="_Toc232546736" w:history="1">
+      <w:hyperlink w:anchor="_Toc232549428" w:history="1">
         <w:r>
           <w:rPr>
             <w:rStyle w:val="Hyperlink"/>
@@ -3416,7 +3415,7 @@
             <w:noProof/>
             <w:webHidden/>
           </w:rPr>
-          <w:instrText xml:space="preserve"> PAGEREF _Toc232546736 \h </w:instrText>
+          <w:instrText xml:space="preserve"> PAGEREF _Toc232549428 \h </w:instrText>
         </w:r>
         <w:r>
           <w:rPr>
@@ -3463,7 +3462,7 @@
           <w14:ligatures w14:val="standardContextual"/>
         </w:rPr>
       </w:pPr>
-      <w:hyperlink w:anchor="_Toc232546737" w:history="1">
+      <w:hyperlink w:anchor="_Toc232549429" w:history="1">
         <w:r>
           <w:rPr>
             <w:rStyle w:val="Hyperlink"/>
@@ -3510,7 +3509,7 @@
             <w:noProof/>
             <w:webHidden/>
           </w:rPr>
-          <w:instrText xml:space="preserve"> PAGEREF _Toc232546737 \h </w:instrText>
+          <w:instrText xml:space="preserve"> PAGEREF _Toc232549429 \h </w:instrText>
         </w:r>
         <w:r>
           <w:rPr>
@@ -3557,7 +3556,7 @@
           <w14:ligatures w14:val="standardContextual"/>
         </w:rPr>
       </w:pPr>
-      <w:hyperlink w:anchor="_Toc232546738" w:history="1">
+      <w:hyperlink w:anchor="_Toc232549430" w:history="1">
         <w:r>
           <w:rPr>
             <w:rStyle w:val="Hyperlink"/>
@@ -3604,7 +3603,7 @@
             <w:noProof/>
             <w:webHidden/>
           </w:rPr>
-          <w:instrText xml:space="preserve"> PAGEREF _Toc232546738 \h </w:instrText>
+          <w:instrText xml:space="preserve"> PAGEREF _Toc232549430 \h </w:instrText>
         </w:r>
         <w:r>
           <w:rPr>
@@ -3651,14 +3650,14 @@
           <w14:ligatures w14:val="standardContextual"/>
         </w:rPr>
       </w:pPr>
-      <w:hyperlink w:anchor="_Toc232546739" w:history="1">
+      <w:hyperlink w:anchor="_Toc232549432" w:history="1">
         <w:r>
           <w:rPr>
             <w:rStyle w:val="Hyperlink"/>
             <w:noProof/>
-            <w:lang w:val="es-HN"/>
-          </w:rPr>
-          <w:t>2.5</w:t>
+            <w:lang w:val="es-ES"/>
+          </w:rPr>
+          <w:t>2.4.1</w:t>
         </w:r>
         <w:r>
           <w:rPr>
@@ -3675,9 +3674,9 @@
           <w:rPr>
             <w:rStyle w:val="Hyperlink"/>
             <w:noProof/>
-            <w:lang w:val="es-HN"/>
-          </w:rPr>
-          <w:t>BRECHA DE INVESTIGACIÓN (RESEARCH GAP)</w:t>
+            <w:lang w:val="es-ES"/>
+          </w:rPr>
+          <w:t>Encuesta Estructurada a Gran Escala</w:t>
         </w:r>
         <w:r>
           <w:rPr>
@@ -3698,7 +3697,7 @@
             <w:noProof/>
             <w:webHidden/>
           </w:rPr>
-          <w:instrText xml:space="preserve"> PAGEREF _Toc232546739 \h </w:instrText>
+          <w:instrText xml:space="preserve"> PAGEREF _Toc232549432 \h </w:instrText>
         </w:r>
         <w:r>
           <w:rPr>
@@ -3731,7 +3730,11 @@
     </w:p>
     <w:p>
       <w:pPr>
-        <w:pStyle w:val="TOC1"/>
+        <w:pStyle w:val="TOC2"/>
+        <w:tabs>
+          <w:tab w:val="left" w:pos="960"/>
+          <w:tab w:val="right" w:leader="dot" w:pos="9350"/>
+        </w:tabs>
         <w:rPr>
           <w:rFonts w:asciiTheme="minorHAnsi" w:eastAsiaTheme="minorEastAsia" w:hAnsiTheme="minorHAnsi"/>
           <w:noProof/>
@@ -3741,24 +3744,43 @@
           <w14:ligatures w14:val="standardContextual"/>
         </w:rPr>
       </w:pPr>
-      <w:hyperlink w:anchor="_Toc232546740" w:history="1">
+      <w:hyperlink w:anchor="_Toc232549433" w:history="1">
         <w:r>
           <w:rPr>
             <w:rStyle w:val="Hyperlink"/>
             <w:noProof/>
-            <w:lang w:val="es-419"/>
-          </w:rPr>
-          <w:t>REFERENCIAS BIBLIOGRÁFICAS</w:t>
-        </w:r>
-        <w:r>
-          <w:rPr>
-            <w:noProof/>
-            <w:webHidden/>
+            <w:lang w:val="es-ES"/>
+          </w:rPr>
+          <w:t>2.4.2</w:t>
+        </w:r>
+        <w:r>
+          <w:rPr>
+            <w:rFonts w:asciiTheme="minorHAnsi" w:eastAsiaTheme="minorEastAsia" w:hAnsiTheme="minorHAnsi"/>
+            <w:noProof/>
+            <w:kern w:val="2"/>
+            <w:szCs w:val="24"/>
+            <w:lang w:val="es-419" w:eastAsia="es-419"/>
+            <w14:ligatures w14:val="standardContextual"/>
           </w:rPr>
           <w:tab/>
         </w:r>
         <w:r>
           <w:rPr>
+            <w:rStyle w:val="Hyperlink"/>
+            <w:noProof/>
+            <w:lang w:val="es-ES"/>
+          </w:rPr>
+          <w:t>Revisión Bibliométrica y Sistemática</w:t>
+        </w:r>
+        <w:r>
+          <w:rPr>
+            <w:noProof/>
+            <w:webHidden/>
+          </w:rPr>
+          <w:tab/>
+        </w:r>
+        <w:r>
+          <w:rPr>
             <w:noProof/>
             <w:webHidden/>
           </w:rPr>
@@ -3769,7 +3791,7 @@
             <w:noProof/>
             <w:webHidden/>
           </w:rPr>
-          <w:instrText xml:space="preserve"> PAGEREF _Toc232546740 \h </w:instrText>
+          <w:instrText xml:space="preserve"> PAGEREF _Toc232549433 \h </w:instrText>
         </w:r>
         <w:r>
           <w:rPr>
@@ -3789,7 +3811,7 @@
             <w:noProof/>
             <w:webHidden/>
           </w:rPr>
-          <w:t>18</w:t>
+          <w:t>17</w:t>
         </w:r>
         <w:r>
           <w:rPr>
@@ -3802,7 +3824,11 @@
     </w:p>
     <w:p>
       <w:pPr>
-        <w:pStyle w:val="TOC1"/>
+        <w:pStyle w:val="TOC2"/>
+        <w:tabs>
+          <w:tab w:val="left" w:pos="960"/>
+          <w:tab w:val="right" w:leader="dot" w:pos="9350"/>
+        </w:tabs>
         <w:rPr>
           <w:rFonts w:asciiTheme="minorHAnsi" w:eastAsiaTheme="minorEastAsia" w:hAnsiTheme="minorHAnsi"/>
           <w:noProof/>
@@ -3812,11 +3838,470 @@
           <w14:ligatures w14:val="standardContextual"/>
         </w:rPr>
       </w:pPr>
-      <w:hyperlink w:anchor="_Toc232546741" w:history="1">
+      <w:hyperlink w:anchor="_Toc232549434" w:history="1">
         <w:r>
           <w:rPr>
             <w:rStyle w:val="Hyperlink"/>
             <w:noProof/>
+            <w:lang w:val="es-ES"/>
+          </w:rPr>
+          <w:t>2.4.3</w:t>
+        </w:r>
+        <w:r>
+          <w:rPr>
+            <w:rFonts w:asciiTheme="minorHAnsi" w:eastAsiaTheme="minorEastAsia" w:hAnsiTheme="minorHAnsi"/>
+            <w:noProof/>
+            <w:kern w:val="2"/>
+            <w:szCs w:val="24"/>
+            <w:lang w:val="es-419" w:eastAsia="es-419"/>
+            <w14:ligatures w14:val="standardContextual"/>
+          </w:rPr>
+          <w:tab/>
+        </w:r>
+        <w:r>
+          <w:rPr>
+            <w:rStyle w:val="Hyperlink"/>
+            <w:noProof/>
+            <w:lang w:val="es-ES"/>
+          </w:rPr>
+          <w:t>Análisis Jurídico Comparativo con Estudio de Caso</w:t>
+        </w:r>
+        <w:r>
+          <w:rPr>
+            <w:noProof/>
+            <w:webHidden/>
+          </w:rPr>
+          <w:tab/>
+        </w:r>
+        <w:r>
+          <w:rPr>
+            <w:noProof/>
+            <w:webHidden/>
+          </w:rPr>
+          <w:fldChar w:fldCharType="begin"/>
+        </w:r>
+        <w:r>
+          <w:rPr>
+            <w:noProof/>
+            <w:webHidden/>
+          </w:rPr>
+          <w:instrText xml:space="preserve"> PAGEREF _Toc232549434 \h </w:instrText>
+        </w:r>
+        <w:r>
+          <w:rPr>
+            <w:noProof/>
+            <w:webHidden/>
+          </w:rPr>
+        </w:r>
+        <w:r>
+          <w:rPr>
+            <w:noProof/>
+            <w:webHidden/>
+          </w:rPr>
+          <w:fldChar w:fldCharType="separate"/>
+        </w:r>
+        <w:r>
+          <w:rPr>
+            <w:noProof/>
+            <w:webHidden/>
+          </w:rPr>
+          <w:t>17</w:t>
+        </w:r>
+        <w:r>
+          <w:rPr>
+            <w:noProof/>
+            <w:webHidden/>
+          </w:rPr>
+          <w:fldChar w:fldCharType="end"/>
+        </w:r>
+      </w:hyperlink>
+    </w:p>
+    <w:p>
+      <w:pPr>
+        <w:pStyle w:val="TOC2"/>
+        <w:tabs>
+          <w:tab w:val="left" w:pos="960"/>
+          <w:tab w:val="right" w:leader="dot" w:pos="9350"/>
+        </w:tabs>
+        <w:rPr>
+          <w:rFonts w:asciiTheme="minorHAnsi" w:eastAsiaTheme="minorEastAsia" w:hAnsiTheme="minorHAnsi"/>
+          <w:noProof/>
+          <w:kern w:val="2"/>
+          <w:szCs w:val="24"/>
+          <w:lang w:val="es-419" w:eastAsia="es-419"/>
+          <w14:ligatures w14:val="standardContextual"/>
+        </w:rPr>
+      </w:pPr>
+      <w:hyperlink w:anchor="_Toc232549435" w:history="1">
+        <w:r>
+          <w:rPr>
+            <w:rStyle w:val="Hyperlink"/>
+            <w:noProof/>
+            <w:lang w:val="es-ES"/>
+          </w:rPr>
+          <w:t>2.4.4</w:t>
+        </w:r>
+        <w:r>
+          <w:rPr>
+            <w:rFonts w:asciiTheme="minorHAnsi" w:eastAsiaTheme="minorEastAsia" w:hAnsiTheme="minorHAnsi"/>
+            <w:noProof/>
+            <w:kern w:val="2"/>
+            <w:szCs w:val="24"/>
+            <w:lang w:val="es-419" w:eastAsia="es-419"/>
+            <w14:ligatures w14:val="standardContextual"/>
+          </w:rPr>
+          <w:tab/>
+        </w:r>
+        <w:r>
+          <w:rPr>
+            <w:rStyle w:val="Hyperlink"/>
+            <w:noProof/>
+            <w:lang w:val="es-ES"/>
+          </w:rPr>
+          <w:t>Análisis de Experto con base en Reportes de Terceros</w:t>
+        </w:r>
+        <w:r>
+          <w:rPr>
+            <w:noProof/>
+            <w:webHidden/>
+          </w:rPr>
+          <w:tab/>
+        </w:r>
+        <w:r>
+          <w:rPr>
+            <w:noProof/>
+            <w:webHidden/>
+          </w:rPr>
+          <w:fldChar w:fldCharType="begin"/>
+        </w:r>
+        <w:r>
+          <w:rPr>
+            <w:noProof/>
+            <w:webHidden/>
+          </w:rPr>
+          <w:instrText xml:space="preserve"> PAGEREF _Toc232549435 \h </w:instrText>
+        </w:r>
+        <w:r>
+          <w:rPr>
+            <w:noProof/>
+            <w:webHidden/>
+          </w:rPr>
+        </w:r>
+        <w:r>
+          <w:rPr>
+            <w:noProof/>
+            <w:webHidden/>
+          </w:rPr>
+          <w:fldChar w:fldCharType="separate"/>
+        </w:r>
+        <w:r>
+          <w:rPr>
+            <w:noProof/>
+            <w:webHidden/>
+          </w:rPr>
+          <w:t>18</w:t>
+        </w:r>
+        <w:r>
+          <w:rPr>
+            <w:noProof/>
+            <w:webHidden/>
+          </w:rPr>
+          <w:fldChar w:fldCharType="end"/>
+        </w:r>
+      </w:hyperlink>
+    </w:p>
+    <w:p>
+      <w:pPr>
+        <w:pStyle w:val="TOC2"/>
+        <w:tabs>
+          <w:tab w:val="left" w:pos="960"/>
+          <w:tab w:val="right" w:leader="dot" w:pos="9350"/>
+        </w:tabs>
+        <w:rPr>
+          <w:rFonts w:asciiTheme="minorHAnsi" w:eastAsiaTheme="minorEastAsia" w:hAnsiTheme="minorHAnsi"/>
+          <w:noProof/>
+          <w:kern w:val="2"/>
+          <w:szCs w:val="24"/>
+          <w:lang w:val="es-419" w:eastAsia="es-419"/>
+          <w14:ligatures w14:val="standardContextual"/>
+        </w:rPr>
+      </w:pPr>
+      <w:hyperlink w:anchor="_Toc232549436" w:history="1">
+        <w:r>
+          <w:rPr>
+            <w:rStyle w:val="Hyperlink"/>
+            <w:noProof/>
+            <w:lang w:val="es-HN"/>
+          </w:rPr>
+          <w:t>2.5</w:t>
+        </w:r>
+        <w:r>
+          <w:rPr>
+            <w:rFonts w:asciiTheme="minorHAnsi" w:eastAsiaTheme="minorEastAsia" w:hAnsiTheme="minorHAnsi"/>
+            <w:noProof/>
+            <w:kern w:val="2"/>
+            <w:szCs w:val="24"/>
+            <w:lang w:val="es-419" w:eastAsia="es-419"/>
+            <w14:ligatures w14:val="standardContextual"/>
+          </w:rPr>
+          <w:tab/>
+        </w:r>
+        <w:r>
+          <w:rPr>
+            <w:rStyle w:val="Hyperlink"/>
+            <w:noProof/>
+            <w:lang w:val="es-HN"/>
+          </w:rPr>
+          <w:t>BRECHA DE INVESTIGACIÓN (RESEARCH GAP)</w:t>
+        </w:r>
+        <w:r>
+          <w:rPr>
+            <w:noProof/>
+            <w:webHidden/>
+          </w:rPr>
+          <w:tab/>
+        </w:r>
+        <w:r>
+          <w:rPr>
+            <w:noProof/>
+            <w:webHidden/>
+          </w:rPr>
+          <w:fldChar w:fldCharType="begin"/>
+        </w:r>
+        <w:r>
+          <w:rPr>
+            <w:noProof/>
+            <w:webHidden/>
+          </w:rPr>
+          <w:instrText xml:space="preserve"> PAGEREF _Toc232549436 \h </w:instrText>
+        </w:r>
+        <w:r>
+          <w:rPr>
+            <w:noProof/>
+            <w:webHidden/>
+          </w:rPr>
+        </w:r>
+        <w:r>
+          <w:rPr>
+            <w:noProof/>
+            <w:webHidden/>
+          </w:rPr>
+          <w:fldChar w:fldCharType="separate"/>
+        </w:r>
+        <w:r>
+          <w:rPr>
+            <w:noProof/>
+            <w:webHidden/>
+          </w:rPr>
+          <w:t>18</w:t>
+        </w:r>
+        <w:r>
+          <w:rPr>
+            <w:noProof/>
+            <w:webHidden/>
+          </w:rPr>
+          <w:fldChar w:fldCharType="end"/>
+        </w:r>
+      </w:hyperlink>
+    </w:p>
+    <w:p>
+      <w:pPr>
+        <w:pStyle w:val="TOC2"/>
+        <w:tabs>
+          <w:tab w:val="left" w:pos="960"/>
+          <w:tab w:val="right" w:leader="dot" w:pos="9350"/>
+        </w:tabs>
+        <w:rPr>
+          <w:rFonts w:asciiTheme="minorHAnsi" w:eastAsiaTheme="minorEastAsia" w:hAnsiTheme="minorHAnsi"/>
+          <w:noProof/>
+          <w:kern w:val="2"/>
+          <w:szCs w:val="24"/>
+          <w:lang w:val="es-419" w:eastAsia="es-419"/>
+          <w14:ligatures w14:val="standardContextual"/>
+        </w:rPr>
+      </w:pPr>
+      <w:hyperlink w:anchor="_Toc232549444" w:history="1">
+        <w:r>
+          <w:rPr>
+            <w:rStyle w:val="Hyperlink"/>
+            <w:noProof/>
+            <w:lang w:val="es-ES"/>
+          </w:rPr>
+          <w:t>2.5.1</w:t>
+        </w:r>
+        <w:r>
+          <w:rPr>
+            <w:rFonts w:asciiTheme="minorHAnsi" w:eastAsiaTheme="minorEastAsia" w:hAnsiTheme="minorHAnsi"/>
+            <w:noProof/>
+            <w:kern w:val="2"/>
+            <w:szCs w:val="24"/>
+            <w:lang w:val="es-419" w:eastAsia="es-419"/>
+            <w14:ligatures w14:val="standardContextual"/>
+          </w:rPr>
+          <w:tab/>
+        </w:r>
+        <w:r>
+          <w:rPr>
+            <w:rStyle w:val="Hyperlink"/>
+            <w:noProof/>
+            <w:lang w:val="es-ES"/>
+          </w:rPr>
+          <w:t>Brecha Geo</w:t>
+        </w:r>
+        <w:r>
+          <w:rPr>
+            <w:rStyle w:val="Hyperlink"/>
+            <w:noProof/>
+            <w:lang w:val="es-ES"/>
+          </w:rPr>
+          <w:t>g</w:t>
+        </w:r>
+        <w:r>
+          <w:rPr>
+            <w:rStyle w:val="Hyperlink"/>
+            <w:noProof/>
+            <w:lang w:val="es-ES"/>
+          </w:rPr>
+          <w:t>ráfica y Contextual</w:t>
+        </w:r>
+        <w:r>
+          <w:rPr>
+            <w:noProof/>
+            <w:webHidden/>
+          </w:rPr>
+          <w:tab/>
+        </w:r>
+        <w:r>
+          <w:rPr>
+            <w:noProof/>
+            <w:webHidden/>
+          </w:rPr>
+          <w:fldChar w:fldCharType="begin"/>
+        </w:r>
+        <w:r>
+          <w:rPr>
+            <w:noProof/>
+            <w:webHidden/>
+          </w:rPr>
+          <w:instrText xml:space="preserve"> PAGEREF _Toc232549444 \h </w:instrText>
+        </w:r>
+        <w:r>
+          <w:rPr>
+            <w:noProof/>
+            <w:webHidden/>
+          </w:rPr>
+        </w:r>
+        <w:r>
+          <w:rPr>
+            <w:noProof/>
+            <w:webHidden/>
+          </w:rPr>
+          <w:fldChar w:fldCharType="separate"/>
+        </w:r>
+        <w:r>
+          <w:rPr>
+            <w:noProof/>
+            <w:webHidden/>
+          </w:rPr>
+          <w:t>18</w:t>
+        </w:r>
+        <w:r>
+          <w:rPr>
+            <w:noProof/>
+            <w:webHidden/>
+          </w:rPr>
+          <w:fldChar w:fldCharType="end"/>
+        </w:r>
+      </w:hyperlink>
+    </w:p>
+    <w:p>
+      <w:pPr>
+        <w:pStyle w:val="TOC1"/>
+        <w:rPr>
+          <w:rFonts w:asciiTheme="minorHAnsi" w:eastAsiaTheme="minorEastAsia" w:hAnsiTheme="minorHAnsi"/>
+          <w:noProof/>
+          <w:kern w:val="2"/>
+          <w:szCs w:val="24"/>
+          <w:lang w:val="es-419" w:eastAsia="es-419"/>
+          <w14:ligatures w14:val="standardContextual"/>
+        </w:rPr>
+      </w:pPr>
+      <w:hyperlink w:anchor="_Toc232549445" w:history="1">
+        <w:r>
+          <w:rPr>
+            <w:rStyle w:val="Hyperlink"/>
+            <w:noProof/>
+            <w:lang w:val="es-419"/>
+          </w:rPr>
+          <w:t>REFERENCIAS BIBLIOGRÁFICAS</w:t>
+        </w:r>
+        <w:r>
+          <w:rPr>
+            <w:noProof/>
+            <w:webHidden/>
+          </w:rPr>
+          <w:tab/>
+        </w:r>
+        <w:r>
+          <w:rPr>
+            <w:noProof/>
+            <w:webHidden/>
+          </w:rPr>
+          <w:fldChar w:fldCharType="begin"/>
+        </w:r>
+        <w:r>
+          <w:rPr>
+            <w:noProof/>
+            <w:webHidden/>
+          </w:rPr>
+          <w:instrText xml:space="preserve"> PAGEREF _Toc232549445 \h </w:instrText>
+        </w:r>
+        <w:r>
+          <w:rPr>
+            <w:noProof/>
+            <w:webHidden/>
+          </w:rPr>
+        </w:r>
+        <w:r>
+          <w:rPr>
+            <w:noProof/>
+            <w:webHidden/>
+          </w:rPr>
+          <w:fldChar w:fldCharType="separate"/>
+        </w:r>
+        <w:r>
+          <w:rPr>
+            <w:noProof/>
+            <w:webHidden/>
+          </w:rPr>
+          <w:t>20</w:t>
+        </w:r>
+        <w:r>
+          <w:rPr>
+            <w:noProof/>
+            <w:webHidden/>
+          </w:rPr>
+          <w:fldChar w:fldCharType="end"/>
+        </w:r>
+      </w:hyperlink>
+    </w:p>
+    <w:p>
+      <w:pPr>
+        <w:pStyle w:val="TOC1"/>
+        <w:rPr>
+          <w:rFonts w:asciiTheme="minorHAnsi" w:eastAsiaTheme="minorEastAsia" w:hAnsiTheme="minorHAnsi"/>
+          <w:noProof/>
+          <w:kern w:val="2"/>
+          <w:szCs w:val="24"/>
+          <w:lang w:val="es-419" w:eastAsia="es-419"/>
+          <w14:ligatures w14:val="standardContextual"/>
+        </w:rPr>
+      </w:pPr>
+      <w:hyperlink w:anchor="_Toc232549446" w:history="1">
+        <w:r>
+          <w:rPr>
+            <w:rStyle w:val="Hyperlink"/>
+            <w:noProof/>
           </w:rPr>
           <w:t>ANEXOS</w:t>
         </w:r>
@@ -3839,7 +4324,7 @@
             <w:noProof/>
             <w:webHidden/>
           </w:rPr>
-          <w:instrText xml:space="preserve"> PAGEREF _Toc232546741 \h </w:instrText>
+          <w:instrText xml:space="preserve"> PAGEREF _Toc232549446 \h </w:instrText>
         </w:r>
         <w:r>
           <w:rPr>
@@ -3859,7 +4344,7 @@
             <w:noProof/>
             <w:webHidden/>
           </w:rPr>
-          <w:t>19</w:t>
+          <w:t>21</w:t>
         </w:r>
         <w:r>
           <w:rPr>
@@ -3901,7 +4386,7 @@
       </w:pPr>
       <w:bookmarkStart w:id="5" w:name="_Toc474331176"/>
       <w:bookmarkStart w:id="6" w:name="_Toc474331375"/>
-      <w:bookmarkStart w:id="7" w:name="_Toc232546703"/>
+      <w:bookmarkStart w:id="7" w:name="_Toc232549395"/>
       <w:r>
         <w:lastRenderedPageBreak/>
         <w:t xml:space="preserve">CAPÍTULO I. </w:t>
@@ -3924,7 +4409,7 @@
       </w:pPr>
       <w:bookmarkStart w:id="8" w:name="_Toc474331178"/>
       <w:bookmarkStart w:id="9" w:name="_Toc474331377"/>
-      <w:bookmarkStart w:id="10" w:name="_Toc232546704"/>
+      <w:bookmarkStart w:id="10" w:name="_Toc232549396"/>
       <w:r>
         <w:t>ANTECEDENTES DEL PROBLEMA</w:t>
       </w:r>
@@ -3944,7 +4429,7 @@
           <w:lang w:val="es-ES"/>
         </w:rPr>
       </w:pPr>
-      <w:bookmarkStart w:id="11" w:name="_Toc232546705"/>
+      <w:bookmarkStart w:id="11" w:name="_Toc232549397"/>
       <w:r>
         <w:rPr>
           <w:lang w:val="es-ES"/>
@@ -4014,7 +4499,7 @@
           <w:lang w:val="es-ES"/>
         </w:rPr>
       </w:pPr>
-      <w:bookmarkStart w:id="12" w:name="_Toc232546706"/>
+      <w:bookmarkStart w:id="12" w:name="_Toc232549398"/>
       <w:r>
         <w:rPr>
           <w:lang w:val="es-ES"/>
@@ -4077,7 +4562,7 @@
           <w:lang w:val="es-ES"/>
         </w:rPr>
       </w:pPr>
-      <w:bookmarkStart w:id="13" w:name="_Toc232546707"/>
+      <w:bookmarkStart w:id="13" w:name="_Toc232549399"/>
       <w:r>
         <w:rPr>
           <w:lang w:val="es-ES"/>
@@ -4182,7 +4667,7 @@
           <w:lang w:val="es-ES"/>
         </w:rPr>
       </w:pPr>
-      <w:bookmarkStart w:id="14" w:name="_Toc232546708"/>
+      <w:bookmarkStart w:id="14" w:name="_Toc232549400"/>
       <w:r>
         <w:rPr>
           <w:lang w:val="es-ES"/>
@@ -4252,7 +4737,7 @@
           <w:lang w:val="es-ES"/>
         </w:rPr>
       </w:pPr>
-      <w:bookmarkStart w:id="15" w:name="_Toc232546709"/>
+      <w:bookmarkStart w:id="15" w:name="_Toc232549401"/>
       <w:r>
         <w:rPr>
           <w:lang w:val="es-ES"/>
@@ -4399,7 +4884,7 @@
       </w:pPr>
       <w:bookmarkStart w:id="16" w:name="_Toc474331179"/>
       <w:bookmarkStart w:id="17" w:name="_Toc474331378"/>
-      <w:bookmarkStart w:id="18" w:name="_Toc232546710"/>
+      <w:bookmarkStart w:id="18" w:name="_Toc232549402"/>
       <w:r>
         <w:rPr>
           <w:lang w:val="es-HN"/>
@@ -4436,7 +4921,7 @@
           <w:lang w:val="es-ES"/>
         </w:rPr>
       </w:pPr>
-      <w:bookmarkStart w:id="19" w:name="_Toc232546711"/>
+      <w:bookmarkStart w:id="19" w:name="_Toc232549403"/>
       <w:r>
         <w:rPr>
           <w:lang w:val="es-ES"/>
@@ -4486,7 +4971,7 @@
           <w:lang w:val="es-ES"/>
         </w:rPr>
       </w:pPr>
-      <w:bookmarkStart w:id="20" w:name="_Toc232546712"/>
+      <w:bookmarkStart w:id="20" w:name="_Toc232549404"/>
       <w:r>
         <w:rPr>
           <w:lang w:val="es-ES"/>
@@ -4535,7 +5020,7 @@
           <w:lang w:val="es-ES"/>
         </w:rPr>
       </w:pPr>
-      <w:bookmarkStart w:id="21" w:name="_Toc232546713"/>
+      <w:bookmarkStart w:id="21" w:name="_Toc232549405"/>
       <w:r>
         <w:rPr>
           <w:lang w:val="es-ES"/>
@@ -4605,7 +5090,7 @@
           <w:lang w:val="es-ES"/>
         </w:rPr>
       </w:pPr>
-      <w:bookmarkStart w:id="22" w:name="_Toc232546714"/>
+      <w:bookmarkStart w:id="22" w:name="_Toc232549406"/>
       <w:r>
         <w:rPr>
           <w:lang w:val="es-ES"/>
@@ -4640,7 +5125,7 @@
           <w:lang w:val="es-ES"/>
         </w:rPr>
       </w:pPr>
-      <w:bookmarkStart w:id="23" w:name="_Toc232546715"/>
+      <w:bookmarkStart w:id="23" w:name="_Toc232549407"/>
       <w:r>
         <w:rPr>
           <w:lang w:val="es-ES"/>
@@ -4688,7 +5173,7 @@
       </w:pPr>
       <w:bookmarkStart w:id="26" w:name="_Toc474331181"/>
       <w:bookmarkStart w:id="27" w:name="_Toc474331380"/>
-      <w:bookmarkStart w:id="28" w:name="_Toc232546716"/>
+      <w:bookmarkStart w:id="28" w:name="_Toc232549408"/>
       <w:r>
         <w:rPr>
           <w:lang w:val="es-HN"/>
@@ -4719,7 +5204,7 @@
           <w:lang w:val="es-ES"/>
         </w:rPr>
       </w:pPr>
-      <w:bookmarkStart w:id="29" w:name="_Toc232546717"/>
+      <w:bookmarkStart w:id="29" w:name="_Toc232549409"/>
       <w:r>
         <w:rPr>
           <w:lang w:val="es-ES"/>
@@ -4775,7 +5260,7 @@
           <w:lang w:val="es-ES"/>
         </w:rPr>
       </w:pPr>
-      <w:bookmarkStart w:id="30" w:name="_Toc232546718"/>
+      <w:bookmarkStart w:id="30" w:name="_Toc232549410"/>
       <w:r>
         <w:rPr>
           <w:lang w:val="es-ES"/>
@@ -4810,7 +5295,7 @@
           <w:lang w:val="es-ES"/>
         </w:rPr>
       </w:pPr>
-      <w:bookmarkStart w:id="31" w:name="_Toc232546719"/>
+      <w:bookmarkStart w:id="31" w:name="_Toc232549411"/>
       <w:r>
         <w:rPr>
           <w:lang w:val="es-ES"/>
@@ -4873,7 +5358,7 @@
           <w:lang w:val="es-ES"/>
         </w:rPr>
       </w:pPr>
-      <w:bookmarkStart w:id="32" w:name="_Toc232546720"/>
+      <w:bookmarkStart w:id="32" w:name="_Toc232549412"/>
       <w:r>
         <w:rPr>
           <w:lang w:val="es-ES"/>
@@ -4922,7 +5407,7 @@
           <w:lang w:val="es-HN"/>
         </w:rPr>
       </w:pPr>
-      <w:bookmarkStart w:id="33" w:name="_Toc232546721"/>
+      <w:bookmarkStart w:id="33" w:name="_Toc232549413"/>
       <w:r>
         <w:rPr>
           <w:lang w:val="es-HN"/>
@@ -4956,7 +5441,7 @@
           <w:lang w:val="es-HN"/>
         </w:rPr>
       </w:pPr>
-      <w:bookmarkStart w:id="34" w:name="_Toc232546722"/>
+      <w:bookmarkStart w:id="34" w:name="_Toc232549414"/>
       <w:r>
         <w:rPr>
           <w:lang w:val="es-HN"/>
@@ -4979,7 +5464,7 @@
           <w:lang w:val="es-ES"/>
         </w:rPr>
       </w:pPr>
-      <w:bookmarkStart w:id="35" w:name="_Toc232546723"/>
+      <w:bookmarkStart w:id="35" w:name="_Toc232549415"/>
       <w:r>
         <w:rPr>
           <w:lang w:val="es-ES"/>
@@ -5029,7 +5514,7 @@
           <w:lang w:val="es-ES"/>
         </w:rPr>
       </w:pPr>
-      <w:bookmarkStart w:id="36" w:name="_Toc232546724"/>
+      <w:bookmarkStart w:id="36" w:name="_Toc232549416"/>
       <w:r>
         <w:rPr>
           <w:lang w:val="es-ES"/>
@@ -5146,7 +5631,7 @@
           <w:lang w:val="es-HN"/>
         </w:rPr>
       </w:pPr>
-      <w:bookmarkStart w:id="37" w:name="_Toc232546725"/>
+      <w:bookmarkStart w:id="37" w:name="_Toc232549417"/>
       <w:r>
         <w:rPr>
           <w:lang w:val="es-HN"/>
@@ -5342,7 +5827,7 @@
           <w:lang w:val="es-HN"/>
         </w:rPr>
       </w:pPr>
-      <w:bookmarkStart w:id="38" w:name="_Toc232546726"/>
+      <w:bookmarkStart w:id="38" w:name="_Toc232549418"/>
       <w:r>
         <w:rPr>
           <w:lang w:val="es-HN"/>
@@ -5482,7 +5967,7 @@
       <w:r>
         <w:br w:type="page"/>
       </w:r>
-      <w:bookmarkStart w:id="39" w:name="_Toc232546727"/>
+      <w:bookmarkStart w:id="39" w:name="_Toc232549419"/>
       <w:r>
         <w:lastRenderedPageBreak/>
         <w:t xml:space="preserve">CAPÍTULO II. </w:t>
@@ -5507,7 +5992,7 @@
       <w:bookmarkStart w:id="40" w:name="_Toc474331183"/>
       <w:bookmarkStart w:id="41" w:name="_Toc474331382"/>
       <w:bookmarkStart w:id="42" w:name="_Toc231766715"/>
-      <w:bookmarkStart w:id="43" w:name="_Toc232546728"/>
+      <w:bookmarkStart w:id="43" w:name="_Toc232549420"/>
       <w:r>
         <w:rPr>
           <w:lang w:val="es-HN"/>
@@ -5542,7 +6027,7 @@
           <w:lang w:val="es-HN"/>
         </w:rPr>
       </w:pPr>
-      <w:bookmarkStart w:id="44" w:name="_Toc232546729"/>
+      <w:bookmarkStart w:id="44" w:name="_Toc232549421"/>
       <w:r>
         <w:rPr>
           <w:lang w:val="es-HN"/>
@@ -5568,7 +6053,7 @@
           <w:lang w:val="es-HN"/>
         </w:rPr>
       </w:pPr>
-      <w:bookmarkStart w:id="45" w:name="_Toc232546730"/>
+      <w:bookmarkStart w:id="45" w:name="_Toc232549422"/>
       <w:r>
         <w:rPr>
           <w:lang w:val="es-HN"/>
@@ -5618,8 +6103,12 @@
       </w:pPr>
       <w:bookmarkStart w:id="46" w:name="_Toc232546271"/>
       <w:bookmarkStart w:id="47" w:name="_Toc232546731"/>
+      <w:bookmarkStart w:id="48" w:name="_Toc232548854"/>
+      <w:bookmarkStart w:id="49" w:name="_Toc232549423"/>
       <w:bookmarkEnd w:id="46"/>
       <w:bookmarkEnd w:id="47"/>
+      <w:bookmarkEnd w:id="48"/>
+      <w:bookmarkEnd w:id="49"/>
     </w:p>
     <w:p>
       <w:pPr>
@@ -5640,10 +6129,14 @@
           <w:lang w:val="es-ES"/>
         </w:rPr>
       </w:pPr>
-      <w:bookmarkStart w:id="48" w:name="_Toc232546272"/>
-      <w:bookmarkStart w:id="49" w:name="_Toc232546732"/>
-      <w:bookmarkEnd w:id="48"/>
-      <w:bookmarkEnd w:id="49"/>
+      <w:bookmarkStart w:id="50" w:name="_Toc232546272"/>
+      <w:bookmarkStart w:id="51" w:name="_Toc232546732"/>
+      <w:bookmarkStart w:id="52" w:name="_Toc232548855"/>
+      <w:bookmarkStart w:id="53" w:name="_Toc232549424"/>
+      <w:bookmarkEnd w:id="50"/>
+      <w:bookmarkEnd w:id="51"/>
+      <w:bookmarkEnd w:id="52"/>
+      <w:bookmarkEnd w:id="53"/>
     </w:p>
     <w:p>
       <w:pPr>
@@ -5664,10 +6157,14 @@
           <w:lang w:val="es-ES"/>
         </w:rPr>
       </w:pPr>
-      <w:bookmarkStart w:id="50" w:name="_Toc232546273"/>
-      <w:bookmarkStart w:id="51" w:name="_Toc232546733"/>
-      <w:bookmarkEnd w:id="50"/>
-      <w:bookmarkEnd w:id="51"/>
+      <w:bookmarkStart w:id="54" w:name="_Toc232546273"/>
+      <w:bookmarkStart w:id="55" w:name="_Toc232546733"/>
+      <w:bookmarkStart w:id="56" w:name="_Toc232548856"/>
+      <w:bookmarkStart w:id="57" w:name="_Toc232549425"/>
+      <w:bookmarkEnd w:id="54"/>
+      <w:bookmarkEnd w:id="55"/>
+      <w:bookmarkEnd w:id="56"/>
+      <w:bookmarkEnd w:id="57"/>
     </w:p>
     <w:p>
       <w:pPr>
@@ -5688,10 +6185,14 @@
           <w:lang w:val="es-ES"/>
         </w:rPr>
       </w:pPr>
-      <w:bookmarkStart w:id="52" w:name="_Toc232546274"/>
-      <w:bookmarkStart w:id="53" w:name="_Toc232546734"/>
-      <w:bookmarkEnd w:id="52"/>
-      <w:bookmarkEnd w:id="53"/>
+      <w:bookmarkStart w:id="58" w:name="_Toc232546274"/>
+      <w:bookmarkStart w:id="59" w:name="_Toc232546734"/>
+      <w:bookmarkStart w:id="60" w:name="_Toc232548857"/>
+      <w:bookmarkStart w:id="61" w:name="_Toc232549426"/>
+      <w:bookmarkEnd w:id="58"/>
+      <w:bookmarkEnd w:id="59"/>
+      <w:bookmarkEnd w:id="60"/>
+      <w:bookmarkEnd w:id="61"/>
     </w:p>
     <w:p>
       <w:pPr>
@@ -5705,14 +6206,14 @@
           <w:lang w:val="es-ES"/>
         </w:rPr>
       </w:pPr>
-      <w:bookmarkStart w:id="54" w:name="_Toc232546735"/>
+      <w:bookmarkStart w:id="62" w:name="_Toc232549427"/>
       <w:r>
         <w:rPr>
           <w:lang w:val="es-ES"/>
         </w:rPr>
         <w:t>Modelo de Madurez de IA Responsable</w:t>
       </w:r>
-      <w:bookmarkEnd w:id="54"/>
+      <w:bookmarkEnd w:id="62"/>
     </w:p>
     <w:p>
       <w:pPr>
@@ -5773,41 +6274,35 @@
         <w:rPr>
           <w:lang w:val="es-419"/>
         </w:rPr>
-        <w:t xml:space="preserve">. El modelo se articula en cinco niveles progresivos, denominados Inicial, Emergente, Determinado, Establecido y Optimizado, que describen una trayectoria desde la ausencia total de procesos formales hasta prácticas proactivas y </w:t>
-      </w:r>
+        <w:t>. El modelo se articula en cinco niveles progresivos, denominados Inicial, Emergente, Determinado, Establecido y Optimizado, que describen una trayectoria desde la ausencia total de procesos formales hasta prácticas proactivas y plenamente operacionalizadas.</w:t>
+      </w:r>
+    </w:p>
+    <w:p>
+      <w:pPr>
+        <w:pStyle w:val="TextoPrincipal"/>
+        <w:rPr>
+          <w:lang w:val="es-419"/>
+        </w:rPr>
+      </w:pPr>
+      <w:r>
+        <w:rPr>
+          <w:lang w:val="es-419"/>
+        </w:rPr>
+        <w:t>Uno de los hallazgos más relevantes del estudio es la identificación sistemática de una brecha entre lo que se planifica y lo que se ejecuta: las organizaciones tienden a documentar políticas de gobernanza más robustas de lo que sus prácticas operativas efectivamente reflejan.</w:t>
+      </w:r>
+    </w:p>
+    <w:p>
+      <w:pPr>
+        <w:pStyle w:val="TextoPrincipal"/>
+        <w:rPr>
+          <w:lang w:val="es-419"/>
+        </w:rPr>
+      </w:pPr>
       <w:r>
         <w:rPr>
           <w:lang w:val="es-419"/>
         </w:rPr>
         <w:lastRenderedPageBreak/>
-        <w:t>plenamente operacionalizadas.</w:t>
-      </w:r>
-    </w:p>
-    <w:p>
-      <w:pPr>
-        <w:pStyle w:val="TextoPrincipal"/>
-        <w:rPr>
-          <w:lang w:val="es-419"/>
-        </w:rPr>
-      </w:pPr>
-      <w:r>
-        <w:rPr>
-          <w:lang w:val="es-419"/>
-        </w:rPr>
-        <w:t>Uno de los hallazgos más relevantes del estudio es la identificación sistemática de una brecha entre lo que se planifica y lo que se ejecuta: las organizaciones tienden a documentar políticas de gobernanza más robustas de lo que sus prácticas operativas efectivamente reflejan.</w:t>
-      </w:r>
-    </w:p>
-    <w:p>
-      <w:pPr>
-        <w:pStyle w:val="TextoPrincipal"/>
-        <w:rPr>
-          <w:lang w:val="es-419"/>
-        </w:rPr>
-      </w:pPr>
-      <w:r>
-        <w:rPr>
-          <w:lang w:val="es-419"/>
-        </w:rPr>
         <w:t>Este modelo es directamente importante para la presente investigación porque proporciona el instrumento conceptual para ubicar a las organizaciones hondureñas en una escala de madurez comparable a la de otras regiones del mundo. Entre los hallazgos, también se señala que América Latina registra los niveles más bajos de madurez en gobernanza de IA responsable entre todas las regiones que fueron evaluadas, con una proporción significativa de organizaciones clasificadas en el nivel Inicial. (Reuel et al., 2025)</w:t>
       </w:r>
     </w:p>
@@ -5823,14 +6318,14 @@
           <w:lang w:val="es-ES"/>
         </w:rPr>
       </w:pPr>
-      <w:bookmarkStart w:id="55" w:name="_Toc232546736"/>
+      <w:bookmarkStart w:id="63" w:name="_Toc232549428"/>
       <w:r>
         <w:rPr>
           <w:lang w:val="es-ES"/>
         </w:rPr>
         <w:t>Marco Comparativo de Regulación Global de IA</w:t>
       </w:r>
-      <w:bookmarkEnd w:id="55"/>
+      <w:bookmarkEnd w:id="63"/>
     </w:p>
     <w:p>
       <w:pPr>
@@ -5887,14 +6382,7 @@
         <w:rPr>
           <w:lang w:val="es-419"/>
         </w:rPr>
-        <w:t xml:space="preserve">El aporte del marco es demostrar que el cumplimiento regulatorio no es un costo estático, sino una estrategia dinámica que condiciona la competitividad de las organizaciones. La autora introduce también el concepto de alineación regulatoria temprana como un factor diferenciador: las organizaciones que incorporan consideraciones de cumplimiento desde las fases iniciales del diseño de sus productos obtienen ventajas en su velocidad de entrada al mercado y una reducción </w:t>
-      </w:r>
-      <w:r>
-        <w:rPr>
-          <w:lang w:val="es-419"/>
-        </w:rPr>
-        <w:lastRenderedPageBreak/>
-        <w:t>de reducción de exposición legal (Vujicic, 2024).</w:t>
+        <w:t>El aporte del marco es demostrar que el cumplimiento regulatorio no es un costo estático, sino una estrategia dinámica que condiciona la competitividad de las organizaciones. La autora introduce también el concepto de alineación regulatoria temprana como un factor diferenciador: las organizaciones que incorporan consideraciones de cumplimiento desde las fases iniciales del diseño de sus productos obtienen ventajas en su velocidad de entrada al mercado y una reducción de reducción de exposición legal (Vujicic, 2024).</w:t>
       </w:r>
     </w:p>
     <w:p>
@@ -5947,14 +6435,15 @@
           <w:lang w:val="es-ES"/>
         </w:rPr>
       </w:pPr>
-      <w:bookmarkStart w:id="56" w:name="_Toc232546737"/>
+      <w:bookmarkStart w:id="64" w:name="_Toc232549429"/>
       <w:r>
         <w:rPr>
           <w:lang w:val="es-ES"/>
         </w:rPr>
+        <w:lastRenderedPageBreak/>
         <w:t>Complementariedad de los Modelos</w:t>
       </w:r>
-      <w:bookmarkEnd w:id="56"/>
+      <w:bookmarkEnd w:id="64"/>
     </w:p>
     <w:p>
       <w:pPr>
@@ -5988,14 +6477,14 @@
           <w:lang w:val="es-HN"/>
         </w:rPr>
       </w:pPr>
-      <w:bookmarkStart w:id="57" w:name="_Toc232546738"/>
+      <w:bookmarkStart w:id="65" w:name="_Toc232549430"/>
       <w:r>
         <w:rPr>
           <w:lang w:val="es-HN"/>
         </w:rPr>
         <w:t>METODOLOGÍAS UTILIZADAS POR OTROS INVESTIGADORES</w:t>
       </w:r>
-      <w:bookmarkEnd w:id="57"/>
+      <w:bookmarkEnd w:id="65"/>
     </w:p>
     <w:p>
       <w:pPr>
@@ -6016,6 +6505,10 @@
           <w:lang w:val="es-ES"/>
         </w:rPr>
       </w:pPr>
+      <w:bookmarkStart w:id="66" w:name="_Toc232548862"/>
+      <w:bookmarkStart w:id="67" w:name="_Toc232549431"/>
+      <w:bookmarkEnd w:id="66"/>
+      <w:bookmarkEnd w:id="67"/>
     </w:p>
     <w:p>
       <w:pPr>
@@ -6029,12 +6522,14 @@
           <w:lang w:val="es-ES"/>
         </w:rPr>
       </w:pPr>
+      <w:bookmarkStart w:id="68" w:name="_Toc232549432"/>
       <w:r>
         <w:rPr>
           <w:lang w:val="es-ES"/>
         </w:rPr>
         <w:t>Encuesta Estructurada a Gran Escala</w:t>
       </w:r>
+      <w:bookmarkEnd w:id="68"/>
     </w:p>
     <w:p>
       <w:pPr>
@@ -6062,12 +6557,14 @@
           <w:lang w:val="es-ES"/>
         </w:rPr>
       </w:pPr>
+      <w:bookmarkStart w:id="69" w:name="_Toc232549433"/>
       <w:r>
         <w:rPr>
           <w:lang w:val="es-ES"/>
         </w:rPr>
         <w:t>Revisión Bibliométrica y Sistemática</w:t>
       </w:r>
+      <w:bookmarkEnd w:id="69"/>
     </w:p>
     <w:p>
       <w:pPr>
@@ -6080,14 +6577,7 @@
         <w:rPr>
           <w:lang w:val="es-ES"/>
         </w:rPr>
-        <w:t xml:space="preserve">Yesuf y Fields (2025) utilizaron un enfoque mixto de análisis bibliométrico y revisión sistemática de artículos científicos. Emplearon herramientas para identificar las estructuras de </w:t>
-      </w:r>
-      <w:r>
-        <w:rPr>
-          <w:lang w:val="es-ES"/>
-        </w:rPr>
-        <w:lastRenderedPageBreak/>
-        <w:t>conocimiento existentes sobre adopción de IA en pymes. También, realizaron un análisis de contenido de estudios para extraer temas emergentes y brechas de investigación. La limitación identificada por los autores es precisamente relacionada con la presente investigación: la escasez de estudios longitudinales y la subrepresentación de pymes en economías en desarrollo.</w:t>
+        <w:t>Yesuf y Fields (2025) utilizaron un enfoque mixto de análisis bibliométrico y revisión sistemática de artículos científicos. Emplearon herramientas para identificar las estructuras de conocimiento existentes sobre adopción de IA en pymes. También, realizaron un análisis de contenido de estudios para extraer temas emergentes y brechas de investigación. La limitación identificada por los autores es precisamente relacionada con la presente investigación: la escasez de estudios longitudinales y la subrepresentación de pymes en economías en desarrollo.</w:t>
       </w:r>
     </w:p>
     <w:p>
@@ -6102,12 +6592,14 @@
           <w:lang w:val="es-ES"/>
         </w:rPr>
       </w:pPr>
+      <w:bookmarkStart w:id="70" w:name="_Toc232549434"/>
       <w:r>
         <w:rPr>
           <w:lang w:val="es-ES"/>
         </w:rPr>
         <w:t>Análisis Jurídico Comparativo con Estudio de Caso</w:t>
       </w:r>
+      <w:bookmarkEnd w:id="70"/>
     </w:p>
     <w:p>
       <w:pPr>
@@ -6120,6 +6612,7 @@
         <w:rPr>
           <w:lang w:val="es-ES"/>
         </w:rPr>
+        <w:lastRenderedPageBreak/>
         <w:t>Vujicic (2024) empleó un enfoque mixto que combina: análisis jurídico de textos normativos, entrevistas semiestructuras a expertos y consultores, y un estudio de caso para simular el proceso de cumplimiento regulatorio en seis jurisdicciones. Este enfoque permitió contrastar el análisis normativo con perspectivas de expertos y una simulación práctica.</w:t>
       </w:r>
     </w:p>
@@ -6149,18 +6642,14 @@
           <w:lang w:val="es-ES"/>
         </w:rPr>
       </w:pPr>
+      <w:bookmarkStart w:id="71" w:name="_Toc232549435"/>
       <w:r>
         <w:rPr>
           <w:lang w:val="es-ES"/>
         </w:rPr>
-        <w:t xml:space="preserve">Análisis </w:t>
-      </w:r>
-      <w:r>
-        <w:rPr>
-          <w:lang w:val="es-ES"/>
-        </w:rPr>
-        <w:t>de Experto con base en Reportes de Terceros</w:t>
-      </w:r>
+        <w:t>Análisis de Experto con base en Reportes de Terceros</w:t>
+      </w:r>
+      <w:bookmarkEnd w:id="71"/>
     </w:p>
     <w:p>
       <w:pPr>
@@ -6188,19 +6677,203 @@
           <w:lang w:val="es-HN"/>
         </w:rPr>
       </w:pPr>
-      <w:bookmarkStart w:id="58" w:name="_Toc232546739"/>
+      <w:bookmarkStart w:id="72" w:name="_Toc232549436"/>
       <w:r>
         <w:rPr>
           <w:lang w:val="es-HN"/>
         </w:rPr>
-        <w:t>BRECHA DE INVESTIGACIÓN (RESEARCH GAP)</w:t>
-      </w:r>
-      <w:bookmarkEnd w:id="58"/>
+        <w:t>BRECHA DE INVESTIGACIÓN</w:t>
+      </w:r>
+      <w:bookmarkEnd w:id="72"/>
+    </w:p>
+    <w:p>
+      <w:pPr>
+        <w:pStyle w:val="ListParagraph"/>
+        <w:numPr>
+          <w:ilvl w:val="0"/>
+          <w:numId w:val="24"/>
+        </w:numPr>
+        <w:spacing w:after="120" w:line="360" w:lineRule="auto"/>
+        <w:outlineLvl w:val="1"/>
+        <w:rPr>
+          <w:rFonts w:ascii="Times New Roman" w:eastAsia="Times New Roman" w:hAnsi="Times New Roman"/>
+          <w:b/>
+          <w:bCs/>
+          <w:vanish/>
+          <w:sz w:val="24"/>
+          <w:szCs w:val="32"/>
+          <w:lang w:val="es-ES"/>
+        </w:rPr>
+      </w:pPr>
+      <w:bookmarkStart w:id="73" w:name="_Toc232549437"/>
+      <w:bookmarkEnd w:id="73"/>
+    </w:p>
+    <w:p>
+      <w:pPr>
+        <w:pStyle w:val="ListParagraph"/>
+        <w:numPr>
+          <w:ilvl w:val="0"/>
+          <w:numId w:val="24"/>
+        </w:numPr>
+        <w:spacing w:after="120" w:line="360" w:lineRule="auto"/>
+        <w:outlineLvl w:val="1"/>
+        <w:rPr>
+          <w:rFonts w:ascii="Times New Roman" w:eastAsia="Times New Roman" w:hAnsi="Times New Roman"/>
+          <w:b/>
+          <w:bCs/>
+          <w:vanish/>
+          <w:sz w:val="24"/>
+          <w:szCs w:val="32"/>
+          <w:lang w:val="es-ES"/>
+        </w:rPr>
+      </w:pPr>
+      <w:bookmarkStart w:id="74" w:name="_Toc232549438"/>
+      <w:bookmarkEnd w:id="74"/>
+    </w:p>
+    <w:p>
+      <w:pPr>
+        <w:pStyle w:val="ListParagraph"/>
+        <w:numPr>
+          <w:ilvl w:val="1"/>
+          <w:numId w:val="24"/>
+        </w:numPr>
+        <w:spacing w:after="120" w:line="360" w:lineRule="auto"/>
+        <w:outlineLvl w:val="1"/>
+        <w:rPr>
+          <w:rFonts w:ascii="Times New Roman" w:eastAsia="Times New Roman" w:hAnsi="Times New Roman"/>
+          <w:b/>
+          <w:bCs/>
+          <w:vanish/>
+          <w:sz w:val="24"/>
+          <w:szCs w:val="32"/>
+          <w:lang w:val="es-ES"/>
+        </w:rPr>
+      </w:pPr>
+      <w:bookmarkStart w:id="75" w:name="_Toc232549439"/>
+      <w:bookmarkEnd w:id="75"/>
+    </w:p>
+    <w:p>
+      <w:pPr>
+        <w:pStyle w:val="ListParagraph"/>
+        <w:numPr>
+          <w:ilvl w:val="1"/>
+          <w:numId w:val="24"/>
+        </w:numPr>
+        <w:spacing w:after="120" w:line="360" w:lineRule="auto"/>
+        <w:outlineLvl w:val="1"/>
+        <w:rPr>
+          <w:rFonts w:ascii="Times New Roman" w:eastAsia="Times New Roman" w:hAnsi="Times New Roman"/>
+          <w:b/>
+          <w:bCs/>
+          <w:vanish/>
+          <w:sz w:val="24"/>
+          <w:szCs w:val="32"/>
+          <w:lang w:val="es-ES"/>
+        </w:rPr>
+      </w:pPr>
+      <w:bookmarkStart w:id="76" w:name="_Toc232549440"/>
+      <w:bookmarkEnd w:id="76"/>
+    </w:p>
+    <w:p>
+      <w:pPr>
+        <w:pStyle w:val="ListParagraph"/>
+        <w:numPr>
+          <w:ilvl w:val="1"/>
+          <w:numId w:val="24"/>
+        </w:numPr>
+        <w:spacing w:after="120" w:line="360" w:lineRule="auto"/>
+        <w:outlineLvl w:val="1"/>
+        <w:rPr>
+          <w:rFonts w:ascii="Times New Roman" w:eastAsia="Times New Roman" w:hAnsi="Times New Roman"/>
+          <w:b/>
+          <w:bCs/>
+          <w:vanish/>
+          <w:sz w:val="24"/>
+          <w:szCs w:val="32"/>
+          <w:lang w:val="es-ES"/>
+        </w:rPr>
+      </w:pPr>
+      <w:bookmarkStart w:id="77" w:name="_Toc232549441"/>
+      <w:bookmarkEnd w:id="77"/>
+    </w:p>
+    <w:p>
+      <w:pPr>
+        <w:pStyle w:val="ListParagraph"/>
+        <w:numPr>
+          <w:ilvl w:val="1"/>
+          <w:numId w:val="24"/>
+        </w:numPr>
+        <w:spacing w:after="120" w:line="360" w:lineRule="auto"/>
+        <w:outlineLvl w:val="1"/>
+        <w:rPr>
+          <w:rFonts w:ascii="Times New Roman" w:eastAsia="Times New Roman" w:hAnsi="Times New Roman"/>
+          <w:b/>
+          <w:bCs/>
+          <w:vanish/>
+          <w:sz w:val="24"/>
+          <w:szCs w:val="32"/>
+          <w:lang w:val="es-ES"/>
+        </w:rPr>
+      </w:pPr>
+      <w:bookmarkStart w:id="78" w:name="_Toc232549442"/>
+      <w:bookmarkEnd w:id="78"/>
+    </w:p>
+    <w:p>
+      <w:pPr>
+        <w:pStyle w:val="ListParagraph"/>
+        <w:numPr>
+          <w:ilvl w:val="1"/>
+          <w:numId w:val="24"/>
+        </w:numPr>
+        <w:spacing w:after="120" w:line="360" w:lineRule="auto"/>
+        <w:outlineLvl w:val="1"/>
+        <w:rPr>
+          <w:rFonts w:ascii="Times New Roman" w:eastAsia="Times New Roman" w:hAnsi="Times New Roman"/>
+          <w:b/>
+          <w:bCs/>
+          <w:vanish/>
+          <w:sz w:val="24"/>
+          <w:szCs w:val="32"/>
+          <w:lang w:val="es-ES"/>
+        </w:rPr>
+      </w:pPr>
+      <w:bookmarkStart w:id="79" w:name="_Toc232549443"/>
+      <w:bookmarkEnd w:id="79"/>
+    </w:p>
+    <w:p>
+      <w:pPr>
+        <w:pStyle w:val="Heading2"/>
+        <w:numPr>
+          <w:ilvl w:val="2"/>
+          <w:numId w:val="24"/>
+        </w:numPr>
+        <w:spacing w:line="360" w:lineRule="auto"/>
+        <w:rPr>
+          <w:lang w:val="es-ES"/>
+        </w:rPr>
+      </w:pPr>
+      <w:bookmarkStart w:id="80" w:name="_Toc232549444"/>
+      <w:r>
+        <w:rPr>
+          <w:lang w:val="es-ES"/>
+        </w:rPr>
+        <w:t>Brecha Geográfica y Contextual</w:t>
+      </w:r>
+      <w:bookmarkEnd w:id="80"/>
     </w:p>
     <w:p>
       <w:pPr>
         <w:pStyle w:val="TextoPrincipal"/>
-      </w:pPr>
+        <w:rPr>
+          <w:lang w:val="es-ES"/>
+        </w:rPr>
+      </w:pPr>
+      <w:r>
+        <w:rPr>
+          <w:lang w:val="es-ES"/>
+        </w:rPr>
+        <w:t>La investigación sobre gobernanza de IA, adopción organizacional y cumplimiento regulatorio se concentra principalmente en economías desarrolladas. Reuel et al. (2025) ofrecen el primer mapa global de madurez en IA responsable, pero reconocen que América Latina está subrepresentada en su muestra y que los resultados no permiten inferencias precisas a nivel de país o sector dentro de la región. Esta ausencia no es solo un vacío académico: implica que las decisiones que hoy toman las organizaciones locales sobre si adoptar, regular o ignorar el uso de IA se toman sin datos locales de referencia.</w:t>
+      </w:r>
     </w:p>
     <w:p>
       <w:pPr>
@@ -6214,6 +6887,7 @@
         <w:rPr>
           <w:lang w:val="es-HN"/>
         </w:rPr>
+        <w:lastRenderedPageBreak/>
         <w:br w:type="page"/>
       </w:r>
     </w:p>
@@ -6224,9 +6898,9 @@
           <w:lang w:val="es-419"/>
         </w:rPr>
       </w:pPr>
-      <w:bookmarkStart w:id="59" w:name="_Toc474331204"/>
-      <w:bookmarkStart w:id="60" w:name="_Toc474331407"/>
-      <w:bookmarkStart w:id="61" w:name="_Toc232546740"/>
+      <w:bookmarkStart w:id="81" w:name="_Toc474331204"/>
+      <w:bookmarkStart w:id="82" w:name="_Toc474331407"/>
+      <w:bookmarkStart w:id="83" w:name="_Toc232549445"/>
       <w:r>
         <w:rPr>
           <w:lang w:val="es-419"/>
@@ -6234,9 +6908,9 @@
         <w:lastRenderedPageBreak/>
         <w:t>REFERENCIAS BIBLIOGRÁFICAS</w:t>
       </w:r>
-      <w:bookmarkEnd w:id="59"/>
-      <w:bookmarkEnd w:id="60"/>
-      <w:bookmarkEnd w:id="61"/>
+      <w:bookmarkEnd w:id="81"/>
+      <w:bookmarkEnd w:id="82"/>
+      <w:bookmarkEnd w:id="83"/>
     </w:p>
     <w:p>
       <w:pPr>
@@ -6353,16 +7027,16 @@
       <w:pPr>
         <w:pStyle w:val="Heading1"/>
       </w:pPr>
-      <w:bookmarkStart w:id="62" w:name="_Toc474331205"/>
-      <w:bookmarkStart w:id="63" w:name="_Toc474331408"/>
-      <w:bookmarkStart w:id="64" w:name="_Toc232546741"/>
+      <w:bookmarkStart w:id="84" w:name="_Toc474331205"/>
+      <w:bookmarkStart w:id="85" w:name="_Toc474331408"/>
+      <w:bookmarkStart w:id="86" w:name="_Toc232549446"/>
       <w:r>
         <w:lastRenderedPageBreak/>
         <w:t>ANEXOS</w:t>
       </w:r>
-      <w:bookmarkEnd w:id="62"/>
-      <w:bookmarkEnd w:id="63"/>
-      <w:bookmarkEnd w:id="64"/>
+      <w:bookmarkEnd w:id="84"/>
+      <w:bookmarkEnd w:id="85"/>
+      <w:bookmarkEnd w:id="86"/>
     </w:p>
     <w:p>
       <w:pPr>
@@ -9104,6 +9778,119 @@
     </w:lvl>
   </w:abstractNum>
   <w:abstractNum w:abstractNumId="20" w15:restartNumberingAfterBreak="0">
+    <w:nsid w:val="60F60CBC"/>
+    <w:multiLevelType w:val="multilevel"/>
+    <w:tmpl w:val="85E29472"/>
+    <w:lvl w:ilvl="0">
+      <w:start w:val="1"/>
+      <w:numFmt w:val="decimal"/>
+      <w:lvlText w:val="%1"/>
+      <w:lvlJc w:val="left"/>
+      <w:pPr>
+        <w:ind w:left="360" w:hanging="360"/>
+      </w:pPr>
+      <w:rPr>
+        <w:rFonts w:hint="default"/>
+      </w:rPr>
+    </w:lvl>
+    <w:lvl w:ilvl="1">
+      <w:start w:val="1"/>
+      <w:numFmt w:val="decimal"/>
+      <w:lvlText w:val="%1.%2"/>
+      <w:lvlJc w:val="left"/>
+      <w:pPr>
+        <w:ind w:left="360" w:hanging="360"/>
+      </w:pPr>
+      <w:rPr>
+        <w:rFonts w:hint="default"/>
+      </w:rPr>
+    </w:lvl>
+    <w:lvl w:ilvl="2">
+      <w:start w:val="1"/>
+      <w:numFmt w:val="decimal"/>
+      <w:lvlText w:val="%1.%2.%3"/>
+      <w:lvlJc w:val="left"/>
+      <w:pPr>
+        <w:ind w:left="720" w:hanging="720"/>
+      </w:pPr>
+      <w:rPr>
+        <w:rFonts w:hint="default"/>
+      </w:rPr>
+    </w:lvl>
+    <w:lvl w:ilvl="3">
+      <w:start w:val="1"/>
+      <w:numFmt w:val="decimal"/>
+      <w:lvlText w:val="%1.%2.%3.%4"/>
+      <w:lvlJc w:val="left"/>
+      <w:pPr>
+        <w:ind w:left="720" w:hanging="720"/>
+      </w:pPr>
+      <w:rPr>
+        <w:rFonts w:hint="default"/>
+      </w:rPr>
+    </w:lvl>
+    <w:lvl w:ilvl="4">
+      <w:start w:val="1"/>
+      <w:numFmt w:val="decimal"/>
+      <w:lvlText w:val="%1.%2.%3.%4.%5"/>
+      <w:lvlJc w:val="left"/>
+      <w:pPr>
+        <w:ind w:left="1080" w:hanging="1080"/>
+      </w:pPr>
+      <w:rPr>
+        <w:rFonts w:hint="default"/>
+      </w:rPr>
+    </w:lvl>
+    <w:lvl w:ilvl="5">
+      <w:start w:val="1"/>
+      <w:numFmt w:val="decimal"/>
+      <w:lvlText w:val="%1.%2.%3.%4.%5.%6"/>
+      <w:lvlJc w:val="left"/>
+      <w:pPr>
+        <w:ind w:left="1080" w:hanging="1080"/>
+      </w:pPr>
+      <w:rPr>
+        <w:rFonts w:hint="default"/>
+      </w:rPr>
+    </w:lvl>
+    <w:lvl w:ilvl="6">
+      <w:start w:val="1"/>
+      <w:numFmt w:val="decimal"/>
+      <w:lvlText w:val="%1.%2.%3.%4.%5.%6.%7"/>
+      <w:lvlJc w:val="left"/>
+      <w:pPr>
+        <w:ind w:left="1440" w:hanging="1440"/>
+      </w:pPr>
+      <w:rPr>
+        <w:rFonts w:hint="default"/>
+      </w:rPr>
+    </w:lvl>
+    <w:lvl w:ilvl="7">
+      <w:start w:val="1"/>
+      <w:numFmt w:val="decimal"/>
+      <w:lvlText w:val="%1.%2.%3.%4.%5.%6.%7.%8"/>
+      <w:lvlJc w:val="left"/>
+      <w:pPr>
+        <w:ind w:left="1440" w:hanging="1440"/>
+      </w:pPr>
+      <w:rPr>
+        <w:rFonts w:hint="default"/>
+      </w:rPr>
+    </w:lvl>
+    <w:lvl w:ilvl="8">
+      <w:start w:val="1"/>
+      <w:numFmt w:val="decimal"/>
+      <w:lvlText w:val="%1.%2.%3.%4.%5.%6.%7.%8.%9"/>
+      <w:lvlJc w:val="left"/>
+      <w:pPr>
+        <w:ind w:left="1800" w:hanging="1800"/>
+      </w:pPr>
+      <w:rPr>
+        <w:rFonts w:hint="default"/>
+      </w:rPr>
+    </w:lvl>
+  </w:abstractNum>
+  <w:abstractNum w:abstractNumId="21" w15:restartNumberingAfterBreak="0">
     <w:nsid w:val="6B4A4C5D"/>
     <w:multiLevelType w:val="hybridMultilevel"/>
     <w:tmpl w:val="A5620E18"/>
@@ -9216,7 +10003,7 @@
       </w:rPr>
     </w:lvl>
   </w:abstractNum>
-  <w:abstractNum w:abstractNumId="21" w15:restartNumberingAfterBreak="0">
+  <w:abstractNum w:abstractNumId="22" w15:restartNumberingAfterBreak="0">
     <w:nsid w:val="74ED718B"/>
     <w:multiLevelType w:val="multilevel"/>
     <w:tmpl w:val="5C88505C"/>
@@ -9329,7 +10116,7 @@
       </w:rPr>
     </w:lvl>
   </w:abstractNum>
-  <w:abstractNum w:abstractNumId="22" w15:restartNumberingAfterBreak="0">
+  <w:abstractNum w:abstractNumId="23" w15:restartNumberingAfterBreak="0">
     <w:nsid w:val="75BF6202"/>
     <w:multiLevelType w:val="multilevel"/>
     <w:tmpl w:val="85E29472"/>
@@ -9470,7 +10257,7 @@
     <w:abstractNumId w:val="4"/>
   </w:num>
   <w:num w:numId="10" w16cid:durableId="1004362059">
-    <w:abstractNumId w:val="20"/>
+    <w:abstractNumId w:val="21"/>
   </w:num>
   <w:num w:numId="11" w16cid:durableId="47271280">
     <w:abstractNumId w:val="3"/>
@@ -9491,7 +10278,7 @@
     <w:abstractNumId w:val="16"/>
   </w:num>
   <w:num w:numId="17" w16cid:durableId="651719968">
-    <w:abstractNumId w:val="21"/>
+    <w:abstractNumId w:val="22"/>
   </w:num>
   <w:num w:numId="18" w16cid:durableId="1037774367">
     <w:abstractNumId w:val="18"/>
@@ -9503,13 +10290,16 @@
     <w:abstractNumId w:val="17"/>
   </w:num>
   <w:num w:numId="21" w16cid:durableId="907612493">
-    <w:abstractNumId w:val="22"/>
+    <w:abstractNumId w:val="23"/>
   </w:num>
   <w:num w:numId="22" w16cid:durableId="1268581924">
     <w:abstractNumId w:val="2"/>
   </w:num>
   <w:num w:numId="23" w16cid:durableId="1165973796">
     <w:abstractNumId w:val="14"/>
+  </w:num>
+  <w:num w:numId="24" w16cid:durableId="908032915">
+    <w:abstractNumId w:val="20"/>
   </w:num>
 </w:numbering>
 </file>

</xml_diff>